<commit_message>
Date les semaines de la grille des thèmes
Les cours démarrent le 28 septembre et s'interrompent les semaines du
19 et du 26 octobre : chaque semaine porte désormais sa date jusqu'à la
trêve de Noël, dont les dates restent à confirmer, comme celles du
carnaval.

Co-Authored-By: Claude Opus 5 <noreply@anthropic.com>
Claude-Session: https://claude.ai/code/session_01RsDkbcD3KwyPviDTcs72WZ
</commit_message>
<xml_diff>
--- a/Themes_des_cours_2026-2027.docx
+++ b/Themes_des_cours_2026-2027.docx
@@ -37,7 +37,7 @@
             <w:r>
               <w:drawing>
                 <wp:inline distT="0" distB="0" distL="0" distR="0">
-                  <wp:extent cx="1905000" cy="542925"/>
+                  <wp:extent cx="1771650" cy="504825"/>
                   <wp:effectExtent t="0" r="0" b="0" l="0"/>
                   <wp:docPr id="1" name="" descr="" title=""/>
                   <wp:cNvGraphicFramePr>
@@ -62,7 +62,7 @@
                         <pic:spPr bwMode="auto">
                           <a:xfrm>
                             <a:off x="0" y="0"/>
-                            <a:ext cx="1905000" cy="542925"/>
+                            <a:ext cx="1771650" cy="504825"/>
                           </a:xfrm>
                           <a:prstGeom prst="rect">
                             <a:avLst/>
@@ -106,7 +106,7 @@
           </w:p>
           <w:p>
             <w:pPr>
-              <w:spacing w:after="0" w:before="0" w:line="240"/>
+              <w:spacing w:after="20" w:before="0" w:line="240"/>
               <w:jc w:val="right"/>
             </w:pPr>
             <w:r>
@@ -119,6 +119,23 @@
                 <w:szCs w:val="20"/>
               </w:rPr>
               <w:t xml:space="preserve">Saison hiver 2026-2027</w:t>
+            </w:r>
+          </w:p>
+          <w:p>
+            <w:pPr>
+              <w:spacing w:after="0" w:before="0" w:line="240"/>
+              <w:jc w:val="right"/>
+            </w:pPr>
+            <w:r>
+              <w:rPr>
+                <w:rFonts w:ascii="Calibri" w:cs="Calibri" w:eastAsia="Calibri" w:hAnsi="Calibri"/>
+                <w:b/>
+                <w:bCs/>
+                <w:color w:val="8A9E28"/>
+                <w:sz w:val="18"/>
+                <w:szCs w:val="18"/>
+              </w:rPr>
+              <w:t xml:space="preserve">Début des cours : lundi 28 septembre 2026</w:t>
             </w:r>
           </w:p>
         </w:tc>
@@ -129,14 +146,14 @@
         <w:pBdr>
           <w:bottom w:val="single" w:color="8A9E28" w:sz="8" w:space="4"/>
         </w:pBdr>
-        <w:spacing w:after="70" w:before="0" w:line="240"/>
+        <w:spacing w:after="50" w:before="0" w:line="240"/>
       </w:pPr>
       <w:r>
         <w:rPr>
           <w:rFonts w:ascii="Calibri" w:cs="Calibri" w:eastAsia="Calibri" w:hAnsi="Calibri"/>
           <w:color w:val="2E2E2E"/>
-          <w:sz w:val="8"/>
-          <w:szCs w:val="8"/>
+          <w:sz w:val="6"/>
+          <w:szCs w:val="6"/>
         </w:rPr>
         <w:t xml:space="preserve"/>
       </w:r>
@@ -154,12 +171,12 @@
         </w:tblBorders>
       </w:tblPr>
       <w:tblGrid>
-        <w:gridCol w:w="1190"/>
+        <w:gridCol w:w="1530"/>
         <w:gridCol w:w="1927"/>
         <w:gridCol w:w="1927"/>
         <w:gridCol w:w="3174"/>
         <w:gridCol w:w="3174"/>
-        <w:gridCol w:w="3741"/>
+        <w:gridCol w:w="3401"/>
       </w:tblGrid>
       <w:tr>
         <w:trPr>
@@ -168,7 +185,7 @@
         </w:trPr>
         <w:tc>
           <w:tcPr>
-            <w:tcW w:type="dxa" w:w="1190"/>
+            <w:tcW w:type="dxa" w:w="1530"/>
             <w:shd w:fill="8A9E28" w:color="auto" w:val="clear"/>
             <w:tcMar>
               <w:top w:type="dxa" w:w="45"/>
@@ -318,7 +335,7 @@
         </w:tc>
         <w:tc>
           <w:tcPr>
-            <w:tcW w:type="dxa" w:w="3741"/>
+            <w:tcW w:type="dxa" w:w="3401"/>
             <w:shd w:fill="8A9E28" w:color="auto" w:val="clear"/>
             <w:tcMar>
               <w:top w:type="dxa" w:w="45"/>
@@ -349,11 +366,11 @@
       </w:tr>
       <w:tr>
         <w:trPr>
-          <w:trHeight w:val="351" w:hRule="atLeast"/>
+          <w:trHeight w:val="334" w:hRule="atLeast"/>
         </w:trPr>
         <w:tc>
           <w:tcPr>
-            <w:tcW w:type="dxa" w:w="1190"/>
+            <w:tcW w:type="dxa" w:w="1530"/>
             <w:shd w:fill="FFFFFF" w:color="auto" w:val="clear"/>
             <w:tcMar>
               <w:top w:type="dxa" w:w="45"/>
@@ -379,6 +396,15 @@
               </w:rPr>
               <w:t xml:space="preserve">Sem 1</w:t>
             </w:r>
+            <w:r>
+              <w:rPr>
+                <w:rFonts w:ascii="Calibri" w:cs="Calibri" w:eastAsia="Calibri" w:hAnsi="Calibri"/>
+                <w:color w:val="6E6E6E"/>
+                <w:sz w:val="15"/>
+                <w:szCs w:val="15"/>
+              </w:rPr>
+              <w:t xml:space="preserve">   28/09</w:t>
+            </w:r>
           </w:p>
         </w:tc>
         <w:tc>
@@ -491,7 +517,7 @@
         </w:tc>
         <w:tc>
           <w:tcPr>
-            <w:tcW w:type="dxa" w:w="3741"/>
+            <w:tcW w:type="dxa" w:w="3401"/>
             <w:shd w:fill="FFFFFF" w:color="auto" w:val="clear"/>
             <w:tcMar>
               <w:top w:type="dxa" w:w="45"/>
@@ -519,11 +545,11 @@
       </w:tr>
       <w:tr>
         <w:trPr>
-          <w:trHeight w:val="351" w:hRule="atLeast"/>
+          <w:trHeight w:val="334" w:hRule="atLeast"/>
         </w:trPr>
         <w:tc>
           <w:tcPr>
-            <w:tcW w:type="dxa" w:w="1190"/>
+            <w:tcW w:type="dxa" w:w="1530"/>
             <w:shd w:fill="FAFAF6" w:color="auto" w:val="clear"/>
             <w:tcMar>
               <w:top w:type="dxa" w:w="45"/>
@@ -549,6 +575,15 @@
               </w:rPr>
               <w:t xml:space="preserve">Sem 2</w:t>
             </w:r>
+            <w:r>
+              <w:rPr>
+                <w:rFonts w:ascii="Calibri" w:cs="Calibri" w:eastAsia="Calibri" w:hAnsi="Calibri"/>
+                <w:color w:val="6E6E6E"/>
+                <w:sz w:val="15"/>
+                <w:szCs w:val="15"/>
+              </w:rPr>
+              <w:t xml:space="preserve">   05/10</w:t>
+            </w:r>
           </w:p>
         </w:tc>
         <w:tc>
@@ -661,7 +696,7 @@
         </w:tc>
         <w:tc>
           <w:tcPr>
-            <w:tcW w:type="dxa" w:w="3741"/>
+            <w:tcW w:type="dxa" w:w="3401"/>
             <w:shd w:fill="FAFAF6" w:color="auto" w:val="clear"/>
             <w:tcMar>
               <w:top w:type="dxa" w:w="45"/>
@@ -689,11 +724,11 @@
       </w:tr>
       <w:tr>
         <w:trPr>
-          <w:trHeight w:val="351" w:hRule="atLeast"/>
+          <w:trHeight w:val="334" w:hRule="atLeast"/>
         </w:trPr>
         <w:tc>
           <w:tcPr>
-            <w:tcW w:type="dxa" w:w="1190"/>
+            <w:tcW w:type="dxa" w:w="1530"/>
             <w:shd w:fill="FFFFFF" w:color="auto" w:val="clear"/>
             <w:tcMar>
               <w:top w:type="dxa" w:w="45"/>
@@ -719,6 +754,15 @@
               </w:rPr>
               <w:t xml:space="preserve">Sem 3</w:t>
             </w:r>
+            <w:r>
+              <w:rPr>
+                <w:rFonts w:ascii="Calibri" w:cs="Calibri" w:eastAsia="Calibri" w:hAnsi="Calibri"/>
+                <w:color w:val="6E6E6E"/>
+                <w:sz w:val="15"/>
+                <w:szCs w:val="15"/>
+              </w:rPr>
+              <w:t xml:space="preserve">   12/10</w:t>
+            </w:r>
           </w:p>
         </w:tc>
         <w:tc>
@@ -831,7 +875,7 @@
         </w:tc>
         <w:tc>
           <w:tcPr>
-            <w:tcW w:type="dxa" w:w="3741"/>
+            <w:tcW w:type="dxa" w:w="3401"/>
             <w:shd w:fill="FFFFFF" w:color="auto" w:val="clear"/>
             <w:tcMar>
               <w:top w:type="dxa" w:w="45"/>
@@ -859,7 +903,7 @@
       </w:tr>
       <w:tr>
         <w:trPr>
-          <w:trHeight w:val="317" w:hRule="atLeast"/>
+          <w:trHeight w:val="289" w:hRule="atLeast"/>
         </w:trPr>
         <w:tc>
           <w:tcPr>
@@ -888,18 +932,18 @@
                 <w:sz w:val="18"/>
                 <w:szCs w:val="18"/>
               </w:rPr>
-              <w:t xml:space="preserve">TOUSSAINT</w:t>
+              <w:t xml:space="preserve">TOUSSAINT — semaines du 19 et du 26 octobre, pas de cours</w:t>
             </w:r>
           </w:p>
         </w:tc>
       </w:tr>
       <w:tr>
         <w:trPr>
-          <w:trHeight w:val="351" w:hRule="atLeast"/>
+          <w:trHeight w:val="334" w:hRule="atLeast"/>
         </w:trPr>
         <w:tc>
           <w:tcPr>
-            <w:tcW w:type="dxa" w:w="1190"/>
+            <w:tcW w:type="dxa" w:w="1530"/>
             <w:shd w:fill="FFFFFF" w:color="auto" w:val="clear"/>
             <w:tcMar>
               <w:top w:type="dxa" w:w="45"/>
@@ -925,6 +969,15 @@
               </w:rPr>
               <w:t xml:space="preserve">Sem 4</w:t>
             </w:r>
+            <w:r>
+              <w:rPr>
+                <w:rFonts w:ascii="Calibri" w:cs="Calibri" w:eastAsia="Calibri" w:hAnsi="Calibri"/>
+                <w:color w:val="6E6E6E"/>
+                <w:sz w:val="15"/>
+                <w:szCs w:val="15"/>
+              </w:rPr>
+              <w:t xml:space="preserve">   02/11</w:t>
+            </w:r>
           </w:p>
         </w:tc>
         <w:tc>
@@ -1037,7 +1090,7 @@
         </w:tc>
         <w:tc>
           <w:tcPr>
-            <w:tcW w:type="dxa" w:w="3741"/>
+            <w:tcW w:type="dxa" w:w="3401"/>
             <w:shd w:fill="FFFFFF" w:color="auto" w:val="clear"/>
             <w:tcMar>
               <w:top w:type="dxa" w:w="45"/>
@@ -1065,11 +1118,11 @@
       </w:tr>
       <w:tr>
         <w:trPr>
-          <w:trHeight w:val="351" w:hRule="atLeast"/>
+          <w:trHeight w:val="334" w:hRule="atLeast"/>
         </w:trPr>
         <w:tc>
           <w:tcPr>
-            <w:tcW w:type="dxa" w:w="1190"/>
+            <w:tcW w:type="dxa" w:w="1530"/>
             <w:shd w:fill="FAFAF6" w:color="auto" w:val="clear"/>
             <w:tcMar>
               <w:top w:type="dxa" w:w="45"/>
@@ -1095,6 +1148,15 @@
               </w:rPr>
               <w:t xml:space="preserve">Sem 5</w:t>
             </w:r>
+            <w:r>
+              <w:rPr>
+                <w:rFonts w:ascii="Calibri" w:cs="Calibri" w:eastAsia="Calibri" w:hAnsi="Calibri"/>
+                <w:color w:val="6E6E6E"/>
+                <w:sz w:val="15"/>
+                <w:szCs w:val="15"/>
+              </w:rPr>
+              <w:t xml:space="preserve">   09/11</w:t>
+            </w:r>
           </w:p>
         </w:tc>
         <w:tc>
@@ -1207,7 +1269,7 @@
         </w:tc>
         <w:tc>
           <w:tcPr>
-            <w:tcW w:type="dxa" w:w="3741"/>
+            <w:tcW w:type="dxa" w:w="3401"/>
             <w:shd w:fill="FAFAF6" w:color="auto" w:val="clear"/>
             <w:tcMar>
               <w:top w:type="dxa" w:w="45"/>
@@ -1235,11 +1297,11 @@
       </w:tr>
       <w:tr>
         <w:trPr>
-          <w:trHeight w:val="351" w:hRule="atLeast"/>
+          <w:trHeight w:val="334" w:hRule="atLeast"/>
         </w:trPr>
         <w:tc>
           <w:tcPr>
-            <w:tcW w:type="dxa" w:w="1190"/>
+            <w:tcW w:type="dxa" w:w="1530"/>
             <w:shd w:fill="FFFFFF" w:color="auto" w:val="clear"/>
             <w:tcMar>
               <w:top w:type="dxa" w:w="45"/>
@@ -1265,6 +1327,15 @@
               </w:rPr>
               <w:t xml:space="preserve">Sem 6</w:t>
             </w:r>
+            <w:r>
+              <w:rPr>
+                <w:rFonts w:ascii="Calibri" w:cs="Calibri" w:eastAsia="Calibri" w:hAnsi="Calibri"/>
+                <w:color w:val="6E6E6E"/>
+                <w:sz w:val="15"/>
+                <w:szCs w:val="15"/>
+              </w:rPr>
+              <w:t xml:space="preserve">   16/11</w:t>
+            </w:r>
           </w:p>
         </w:tc>
         <w:tc>
@@ -1377,7 +1448,7 @@
         </w:tc>
         <w:tc>
           <w:tcPr>
-            <w:tcW w:type="dxa" w:w="3741"/>
+            <w:tcW w:type="dxa" w:w="3401"/>
             <w:shd w:fill="FFFFFF" w:color="auto" w:val="clear"/>
             <w:tcMar>
               <w:top w:type="dxa" w:w="45"/>
@@ -1405,11 +1476,11 @@
       </w:tr>
       <w:tr>
         <w:trPr>
-          <w:trHeight w:val="351" w:hRule="atLeast"/>
+          <w:trHeight w:val="334" w:hRule="atLeast"/>
         </w:trPr>
         <w:tc>
           <w:tcPr>
-            <w:tcW w:type="dxa" w:w="1190"/>
+            <w:tcW w:type="dxa" w:w="1530"/>
             <w:shd w:fill="FAFAF6" w:color="auto" w:val="clear"/>
             <w:tcMar>
               <w:top w:type="dxa" w:w="45"/>
@@ -1435,6 +1506,15 @@
               </w:rPr>
               <w:t xml:space="preserve">Sem 7</w:t>
             </w:r>
+            <w:r>
+              <w:rPr>
+                <w:rFonts w:ascii="Calibri" w:cs="Calibri" w:eastAsia="Calibri" w:hAnsi="Calibri"/>
+                <w:color w:val="6E6E6E"/>
+                <w:sz w:val="15"/>
+                <w:szCs w:val="15"/>
+              </w:rPr>
+              <w:t xml:space="preserve">   23/11</w:t>
+            </w:r>
           </w:p>
         </w:tc>
         <w:tc>
@@ -1547,7 +1627,7 @@
         </w:tc>
         <w:tc>
           <w:tcPr>
-            <w:tcW w:type="dxa" w:w="3741"/>
+            <w:tcW w:type="dxa" w:w="3401"/>
             <w:shd w:fill="FAFAF6" w:color="auto" w:val="clear"/>
             <w:tcMar>
               <w:top w:type="dxa" w:w="45"/>
@@ -1575,11 +1655,11 @@
       </w:tr>
       <w:tr>
         <w:trPr>
-          <w:trHeight w:val="351" w:hRule="atLeast"/>
+          <w:trHeight w:val="334" w:hRule="atLeast"/>
         </w:trPr>
         <w:tc>
           <w:tcPr>
-            <w:tcW w:type="dxa" w:w="1190"/>
+            <w:tcW w:type="dxa" w:w="1530"/>
             <w:shd w:fill="FFFFFF" w:color="auto" w:val="clear"/>
             <w:tcMar>
               <w:top w:type="dxa" w:w="45"/>
@@ -1605,6 +1685,15 @@
               </w:rPr>
               <w:t xml:space="preserve">Sem 8</w:t>
             </w:r>
+            <w:r>
+              <w:rPr>
+                <w:rFonts w:ascii="Calibri" w:cs="Calibri" w:eastAsia="Calibri" w:hAnsi="Calibri"/>
+                <w:color w:val="6E6E6E"/>
+                <w:sz w:val="15"/>
+                <w:szCs w:val="15"/>
+              </w:rPr>
+              <w:t xml:space="preserve">   30/11</w:t>
+            </w:r>
           </w:p>
         </w:tc>
         <w:tc>
@@ -1717,7 +1806,7 @@
         </w:tc>
         <w:tc>
           <w:tcPr>
-            <w:tcW w:type="dxa" w:w="3741"/>
+            <w:tcW w:type="dxa" w:w="3401"/>
             <w:shd w:fill="FFFFFF" w:color="auto" w:val="clear"/>
             <w:tcMar>
               <w:top w:type="dxa" w:w="45"/>
@@ -1745,11 +1834,11 @@
       </w:tr>
       <w:tr>
         <w:trPr>
-          <w:trHeight w:val="351" w:hRule="atLeast"/>
+          <w:trHeight w:val="334" w:hRule="atLeast"/>
         </w:trPr>
         <w:tc>
           <w:tcPr>
-            <w:tcW w:type="dxa" w:w="1190"/>
+            <w:tcW w:type="dxa" w:w="1530"/>
             <w:shd w:fill="FAFAF6" w:color="auto" w:val="clear"/>
             <w:tcMar>
               <w:top w:type="dxa" w:w="45"/>
@@ -1775,6 +1864,15 @@
               </w:rPr>
               <w:t xml:space="preserve">Sem 9</w:t>
             </w:r>
+            <w:r>
+              <w:rPr>
+                <w:rFonts w:ascii="Calibri" w:cs="Calibri" w:eastAsia="Calibri" w:hAnsi="Calibri"/>
+                <w:color w:val="6E6E6E"/>
+                <w:sz w:val="15"/>
+                <w:szCs w:val="15"/>
+              </w:rPr>
+              <w:t xml:space="preserve">   07/12</w:t>
+            </w:r>
           </w:p>
         </w:tc>
         <w:tc>
@@ -1887,7 +1985,7 @@
         </w:tc>
         <w:tc>
           <w:tcPr>
-            <w:tcW w:type="dxa" w:w="3741"/>
+            <w:tcW w:type="dxa" w:w="3401"/>
             <w:shd w:fill="FAFAF6" w:color="auto" w:val="clear"/>
             <w:tcMar>
               <w:top w:type="dxa" w:w="45"/>
@@ -1915,11 +2013,11 @@
       </w:tr>
       <w:tr>
         <w:trPr>
-          <w:trHeight w:val="351" w:hRule="atLeast"/>
+          <w:trHeight w:val="334" w:hRule="atLeast"/>
         </w:trPr>
         <w:tc>
           <w:tcPr>
-            <w:tcW w:type="dxa" w:w="1190"/>
+            <w:tcW w:type="dxa" w:w="1530"/>
             <w:shd w:fill="FFFFFF" w:color="auto" w:val="clear"/>
             <w:tcMar>
               <w:top w:type="dxa" w:w="45"/>
@@ -1945,6 +2043,15 @@
               </w:rPr>
               <w:t xml:space="preserve">Sem 10</w:t>
             </w:r>
+            <w:r>
+              <w:rPr>
+                <w:rFonts w:ascii="Calibri" w:cs="Calibri" w:eastAsia="Calibri" w:hAnsi="Calibri"/>
+                <w:color w:val="6E6E6E"/>
+                <w:sz w:val="15"/>
+                <w:szCs w:val="15"/>
+              </w:rPr>
+              <w:t xml:space="preserve">   14/12</w:t>
+            </w:r>
           </w:p>
         </w:tc>
         <w:tc>
@@ -2057,7 +2164,7 @@
         </w:tc>
         <w:tc>
           <w:tcPr>
-            <w:tcW w:type="dxa" w:w="3741"/>
+            <w:tcW w:type="dxa" w:w="3401"/>
             <w:shd w:fill="FFFFFF" w:color="auto" w:val="clear"/>
             <w:tcMar>
               <w:top w:type="dxa" w:w="45"/>
@@ -2085,7 +2192,7 @@
       </w:tr>
       <w:tr>
         <w:trPr>
-          <w:trHeight w:val="317" w:hRule="atLeast"/>
+          <w:trHeight w:val="289" w:hRule="atLeast"/>
         </w:trPr>
         <w:tc>
           <w:tcPr>
@@ -2114,18 +2221,18 @@
                 <w:sz w:val="18"/>
                 <w:szCs w:val="18"/>
               </w:rPr>
-              <w:t xml:space="preserve">NOËL</w:t>
+              <w:t xml:space="preserve">NOËL — dates à confirmer</w:t>
             </w:r>
           </w:p>
         </w:tc>
       </w:tr>
       <w:tr>
         <w:trPr>
-          <w:trHeight w:val="351" w:hRule="atLeast"/>
+          <w:trHeight w:val="334" w:hRule="atLeast"/>
         </w:trPr>
         <w:tc>
           <w:tcPr>
-            <w:tcW w:type="dxa" w:w="1190"/>
+            <w:tcW w:type="dxa" w:w="1530"/>
             <w:shd w:fill="FFFFFF" w:color="auto" w:val="clear"/>
             <w:tcMar>
               <w:top w:type="dxa" w:w="45"/>
@@ -2263,7 +2370,7 @@
         </w:tc>
         <w:tc>
           <w:tcPr>
-            <w:tcW w:type="dxa" w:w="3741"/>
+            <w:tcW w:type="dxa" w:w="3401"/>
             <w:shd w:fill="FFFFFF" w:color="auto" w:val="clear"/>
             <w:tcMar>
               <w:top w:type="dxa" w:w="45"/>
@@ -2291,11 +2398,11 @@
       </w:tr>
       <w:tr>
         <w:trPr>
-          <w:trHeight w:val="351" w:hRule="atLeast"/>
+          <w:trHeight w:val="334" w:hRule="atLeast"/>
         </w:trPr>
         <w:tc>
           <w:tcPr>
-            <w:tcW w:type="dxa" w:w="1190"/>
+            <w:tcW w:type="dxa" w:w="1530"/>
             <w:shd w:fill="FAFAF6" w:color="auto" w:val="clear"/>
             <w:tcMar>
               <w:top w:type="dxa" w:w="45"/>
@@ -2433,7 +2540,7 @@
         </w:tc>
         <w:tc>
           <w:tcPr>
-            <w:tcW w:type="dxa" w:w="3741"/>
+            <w:tcW w:type="dxa" w:w="3401"/>
             <w:shd w:fill="FAFAF6" w:color="auto" w:val="clear"/>
             <w:tcMar>
               <w:top w:type="dxa" w:w="45"/>
@@ -2461,11 +2568,11 @@
       </w:tr>
       <w:tr>
         <w:trPr>
-          <w:trHeight w:val="351" w:hRule="atLeast"/>
+          <w:trHeight w:val="334" w:hRule="atLeast"/>
         </w:trPr>
         <w:tc>
           <w:tcPr>
-            <w:tcW w:type="dxa" w:w="1190"/>
+            <w:tcW w:type="dxa" w:w="1530"/>
             <w:shd w:fill="FFFFFF" w:color="auto" w:val="clear"/>
             <w:tcMar>
               <w:top w:type="dxa" w:w="45"/>
@@ -2603,7 +2710,7 @@
         </w:tc>
         <w:tc>
           <w:tcPr>
-            <w:tcW w:type="dxa" w:w="3741"/>
+            <w:tcW w:type="dxa" w:w="3401"/>
             <w:shd w:fill="FFFFFF" w:color="auto" w:val="clear"/>
             <w:tcMar>
               <w:top w:type="dxa" w:w="45"/>
@@ -2631,11 +2738,11 @@
       </w:tr>
       <w:tr>
         <w:trPr>
-          <w:trHeight w:val="351" w:hRule="atLeast"/>
+          <w:trHeight w:val="334" w:hRule="atLeast"/>
         </w:trPr>
         <w:tc>
           <w:tcPr>
-            <w:tcW w:type="dxa" w:w="1190"/>
+            <w:tcW w:type="dxa" w:w="1530"/>
             <w:shd w:fill="FAFAF6" w:color="auto" w:val="clear"/>
             <w:tcMar>
               <w:top w:type="dxa" w:w="45"/>
@@ -2773,7 +2880,7 @@
         </w:tc>
         <w:tc>
           <w:tcPr>
-            <w:tcW w:type="dxa" w:w="3741"/>
+            <w:tcW w:type="dxa" w:w="3401"/>
             <w:shd w:fill="FAFAF6" w:color="auto" w:val="clear"/>
             <w:tcMar>
               <w:top w:type="dxa" w:w="45"/>
@@ -2801,11 +2908,11 @@
       </w:tr>
       <w:tr>
         <w:trPr>
-          <w:trHeight w:val="351" w:hRule="atLeast"/>
+          <w:trHeight w:val="334" w:hRule="atLeast"/>
         </w:trPr>
         <w:tc>
           <w:tcPr>
-            <w:tcW w:type="dxa" w:w="1190"/>
+            <w:tcW w:type="dxa" w:w="1530"/>
             <w:shd w:fill="FFFFFF" w:color="auto" w:val="clear"/>
             <w:tcMar>
               <w:top w:type="dxa" w:w="45"/>
@@ -2943,7 +3050,7 @@
         </w:tc>
         <w:tc>
           <w:tcPr>
-            <w:tcW w:type="dxa" w:w="3741"/>
+            <w:tcW w:type="dxa" w:w="3401"/>
             <w:shd w:fill="FFFFFF" w:color="auto" w:val="clear"/>
             <w:tcMar>
               <w:top w:type="dxa" w:w="45"/>
@@ -2971,11 +3078,11 @@
       </w:tr>
       <w:tr>
         <w:trPr>
-          <w:trHeight w:val="351" w:hRule="atLeast"/>
+          <w:trHeight w:val="334" w:hRule="atLeast"/>
         </w:trPr>
         <w:tc>
           <w:tcPr>
-            <w:tcW w:type="dxa" w:w="1190"/>
+            <w:tcW w:type="dxa" w:w="1530"/>
             <w:shd w:fill="FAFAF6" w:color="auto" w:val="clear"/>
             <w:tcMar>
               <w:top w:type="dxa" w:w="45"/>
@@ -3113,7 +3220,7 @@
         </w:tc>
         <w:tc>
           <w:tcPr>
-            <w:tcW w:type="dxa" w:w="3741"/>
+            <w:tcW w:type="dxa" w:w="3401"/>
             <w:shd w:fill="FAFAF6" w:color="auto" w:val="clear"/>
             <w:tcMar>
               <w:top w:type="dxa" w:w="45"/>
@@ -3141,7 +3248,7 @@
       </w:tr>
       <w:tr>
         <w:trPr>
-          <w:trHeight w:val="317" w:hRule="atLeast"/>
+          <w:trHeight w:val="289" w:hRule="atLeast"/>
         </w:trPr>
         <w:tc>
           <w:tcPr>
@@ -3170,18 +3277,18 @@
                 <w:sz w:val="18"/>
                 <w:szCs w:val="18"/>
               </w:rPr>
-              <w:t xml:space="preserve">CARNAVAL</w:t>
+              <w:t xml:space="preserve">CARNAVAL — dates à confirmer</w:t>
             </w:r>
           </w:p>
         </w:tc>
       </w:tr>
       <w:tr>
         <w:trPr>
-          <w:trHeight w:val="351" w:hRule="atLeast"/>
+          <w:trHeight w:val="334" w:hRule="atLeast"/>
         </w:trPr>
         <w:tc>
           <w:tcPr>
-            <w:tcW w:type="dxa" w:w="1190"/>
+            <w:tcW w:type="dxa" w:w="1530"/>
             <w:shd w:fill="FFFFFF" w:color="auto" w:val="clear"/>
             <w:tcMar>
               <w:top w:type="dxa" w:w="45"/>
@@ -3319,7 +3426,7 @@
         </w:tc>
         <w:tc>
           <w:tcPr>
-            <w:tcW w:type="dxa" w:w="3741"/>
+            <w:tcW w:type="dxa" w:w="3401"/>
             <w:shd w:fill="FFFFFF" w:color="auto" w:val="clear"/>
             <w:tcMar>
               <w:top w:type="dxa" w:w="45"/>
@@ -3347,11 +3454,11 @@
       </w:tr>
       <w:tr>
         <w:trPr>
-          <w:trHeight w:val="351" w:hRule="atLeast"/>
+          <w:trHeight w:val="334" w:hRule="atLeast"/>
         </w:trPr>
         <w:tc>
           <w:tcPr>
-            <w:tcW w:type="dxa" w:w="1190"/>
+            <w:tcW w:type="dxa" w:w="1530"/>
             <w:shd w:fill="FAFAF6" w:color="auto" w:val="clear"/>
             <w:tcMar>
               <w:top w:type="dxa" w:w="45"/>
@@ -3489,7 +3596,7 @@
         </w:tc>
         <w:tc>
           <w:tcPr>
-            <w:tcW w:type="dxa" w:w="3741"/>
+            <w:tcW w:type="dxa" w:w="3401"/>
             <w:shd w:fill="FAFAF6" w:color="auto" w:val="clear"/>
             <w:tcMar>
               <w:top w:type="dxa" w:w="45"/>
@@ -3517,11 +3624,11 @@
       </w:tr>
       <w:tr>
         <w:trPr>
-          <w:trHeight w:val="351" w:hRule="atLeast"/>
+          <w:trHeight w:val="334" w:hRule="atLeast"/>
         </w:trPr>
         <w:tc>
           <w:tcPr>
-            <w:tcW w:type="dxa" w:w="1190"/>
+            <w:tcW w:type="dxa" w:w="1530"/>
             <w:shd w:fill="FFFFFF" w:color="auto" w:val="clear"/>
             <w:tcMar>
               <w:top w:type="dxa" w:w="45"/>
@@ -3659,7 +3766,7 @@
         </w:tc>
         <w:tc>
           <w:tcPr>
-            <w:tcW w:type="dxa" w:w="3741"/>
+            <w:tcW w:type="dxa" w:w="3401"/>
             <w:shd w:fill="FFFFFF" w:color="auto" w:val="clear"/>
             <w:tcMar>
               <w:top w:type="dxa" w:w="45"/>
@@ -3687,11 +3794,11 @@
       </w:tr>
       <w:tr>
         <w:trPr>
-          <w:trHeight w:val="351" w:hRule="atLeast"/>
+          <w:trHeight w:val="334" w:hRule="atLeast"/>
         </w:trPr>
         <w:tc>
           <w:tcPr>
-            <w:tcW w:type="dxa" w:w="1190"/>
+            <w:tcW w:type="dxa" w:w="1530"/>
             <w:shd w:fill="FAFAF6" w:color="auto" w:val="clear"/>
             <w:tcMar>
               <w:top w:type="dxa" w:w="45"/>
@@ -3829,7 +3936,7 @@
         </w:tc>
         <w:tc>
           <w:tcPr>
-            <w:tcW w:type="dxa" w:w="3741"/>
+            <w:tcW w:type="dxa" w:w="3401"/>
             <w:shd w:fill="FAFAF6" w:color="auto" w:val="clear"/>
             <w:tcMar>
               <w:top w:type="dxa" w:w="45"/>
@@ -4017,7 +4124,7 @@
     <w:sectPr>
       <w:footerReference w:type="default" r:id="rId7"/>
       <w:pgSz w:w="16838" w:h="11906" w:orient="landscape"/>
-      <w:pgMar w:top="566" w:right="850" w:bottom="510" w:left="850" w:header="708" w:footer="708" w:gutter="0"/>
+      <w:pgMar w:top="453" w:right="793" w:bottom="396" w:left="793" w:header="708" w:footer="708" w:gutter="0"/>
       <w:pgNumType/>
       <w:docGrid w:linePitch="360"/>
     </w:sectPr>

</xml_diff>

<commit_message>
Cale la grille des thèmes sur le calendrier réel de la saison
Les vingt-huit semaines de cours et les cinq interruptions sont
désormais dérivées du calendrier officiel : chaque semaine porte sa
date, chaque interruption ses bornes. Les thèmes de la saison passée
couvrent les vingt premières semaines ; les huit dernières restent à
définir.

Co-Authored-By: Claude Opus 5 <noreply@anthropic.com>
Claude-Session: https://claude.ai/code/session_01RsDkbcD3KwyPviDTcs72WZ
</commit_message>
<xml_diff>
--- a/Themes_des_cours_2026-2027.docx
+++ b/Themes_des_cours_2026-2027.docx
@@ -118,7 +118,7 @@
                 <w:sz w:val="20"/>
                 <w:szCs w:val="20"/>
               </w:rPr>
-              <w:t xml:space="preserve">Saison hiver 2026-2027</w:t>
+              <w:t xml:space="preserve">Saison 2026-2027</w:t>
             </w:r>
           </w:p>
           <w:p>
@@ -135,7 +135,7 @@
                 <w:sz w:val="18"/>
                 <w:szCs w:val="18"/>
               </w:rPr>
-              <w:t xml:space="preserve">Début des cours : lundi 28 septembre 2026</w:t>
+              <w:t xml:space="preserve">Du lundi 28 septembre 2026 au samedi 19 juin 2027  ·  28 semaines</w:t>
             </w:r>
           </w:p>
         </w:tc>
@@ -932,7 +932,7 @@
                 <w:sz w:val="18"/>
                 <w:szCs w:val="18"/>
               </w:rPr>
-              <w:t xml:space="preserve">TOUSSAINT — semaines du 19 et du 26 octobre, pas de cours</w:t>
+              <w:t xml:space="preserve">TOUSSAINT — du 17/10 au 30/10, pas de cours</w:t>
             </w:r>
           </w:p>
         </w:tc>
@@ -2221,7 +2221,7 @@
                 <w:sz w:val="18"/>
                 <w:szCs w:val="18"/>
               </w:rPr>
-              <w:t xml:space="preserve">NOËL — dates à confirmer</w:t>
+              <w:t xml:space="preserve">NOËL — du 20/12 au 03/01, pas de cours</w:t>
             </w:r>
           </w:p>
         </w:tc>
@@ -2258,6 +2258,15 @@
               </w:rPr>
               <w:t xml:space="preserve">Sem 11</w:t>
             </w:r>
+            <w:r>
+              <w:rPr>
+                <w:rFonts w:ascii="Calibri" w:cs="Calibri" w:eastAsia="Calibri" w:hAnsi="Calibri"/>
+                <w:color w:val="6E6E6E"/>
+                <w:sz w:val="15"/>
+                <w:szCs w:val="15"/>
+              </w:rPr>
+              <w:t xml:space="preserve">   04/01</w:t>
+            </w:r>
           </w:p>
         </w:tc>
         <w:tc>
@@ -2428,6 +2437,15 @@
               </w:rPr>
               <w:t xml:space="preserve">Sem 12</w:t>
             </w:r>
+            <w:r>
+              <w:rPr>
+                <w:rFonts w:ascii="Calibri" w:cs="Calibri" w:eastAsia="Calibri" w:hAnsi="Calibri"/>
+                <w:color w:val="6E6E6E"/>
+                <w:sz w:val="15"/>
+                <w:szCs w:val="15"/>
+              </w:rPr>
+              <w:t xml:space="preserve">   11/01</w:t>
+            </w:r>
           </w:p>
         </w:tc>
         <w:tc>
@@ -2598,6 +2616,15 @@
               </w:rPr>
               <w:t xml:space="preserve">Sem 13</w:t>
             </w:r>
+            <w:r>
+              <w:rPr>
+                <w:rFonts w:ascii="Calibri" w:cs="Calibri" w:eastAsia="Calibri" w:hAnsi="Calibri"/>
+                <w:color w:val="6E6E6E"/>
+                <w:sz w:val="15"/>
+                <w:szCs w:val="15"/>
+              </w:rPr>
+              <w:t xml:space="preserve">   18/01</w:t>
+            </w:r>
           </w:p>
         </w:tc>
         <w:tc>
@@ -2768,6 +2795,15 @@
               </w:rPr>
               <w:t xml:space="preserve">Sem 14</w:t>
             </w:r>
+            <w:r>
+              <w:rPr>
+                <w:rFonts w:ascii="Calibri" w:cs="Calibri" w:eastAsia="Calibri" w:hAnsi="Calibri"/>
+                <w:color w:val="6E6E6E"/>
+                <w:sz w:val="15"/>
+                <w:szCs w:val="15"/>
+              </w:rPr>
+              <w:t xml:space="preserve">   25/01</w:t>
+            </w:r>
           </w:p>
         </w:tc>
         <w:tc>
@@ -2938,6 +2974,15 @@
               </w:rPr>
               <w:t xml:space="preserve">Sem 15</w:t>
             </w:r>
+            <w:r>
+              <w:rPr>
+                <w:rFonts w:ascii="Calibri" w:cs="Calibri" w:eastAsia="Calibri" w:hAnsi="Calibri"/>
+                <w:color w:val="6E6E6E"/>
+                <w:sz w:val="15"/>
+                <w:szCs w:val="15"/>
+              </w:rPr>
+              <w:t xml:space="preserve">   01/02</w:t>
+            </w:r>
           </w:p>
         </w:tc>
         <w:tc>
@@ -3108,6 +3153,15 @@
               </w:rPr>
               <w:t xml:space="preserve">Sem 16</w:t>
             </w:r>
+            <w:r>
+              <w:rPr>
+                <w:rFonts w:ascii="Calibri" w:cs="Calibri" w:eastAsia="Calibri" w:hAnsi="Calibri"/>
+                <w:color w:val="6E6E6E"/>
+                <w:sz w:val="15"/>
+                <w:szCs w:val="15"/>
+              </w:rPr>
+              <w:t xml:space="preserve">   08/02</w:t>
+            </w:r>
           </w:p>
         </w:tc>
         <w:tc>
@@ -3242,6 +3296,185 @@
                 <w:szCs w:val="16"/>
               </w:rPr>
               <w:t xml:space="preserve">Phases de jeu avec service</w:t>
+            </w:r>
+          </w:p>
+        </w:tc>
+      </w:tr>
+      <w:tr>
+        <w:trPr>
+          <w:trHeight w:val="334" w:hRule="atLeast"/>
+        </w:trPr>
+        <w:tc>
+          <w:tcPr>
+            <w:tcW w:type="dxa" w:w="1530"/>
+            <w:shd w:fill="FFFFFF" w:color="auto" w:val="clear"/>
+            <w:tcMar>
+              <w:top w:type="dxa" w:w="45"/>
+              <w:left w:type="dxa" w:w="102"/>
+              <w:bottom w:type="dxa" w:w="45"/>
+              <w:right w:type="dxa" w:w="102"/>
+            </w:tcMar>
+            <w:vAlign w:val="center"/>
+          </w:tcPr>
+          <w:p>
+            <w:pPr>
+              <w:spacing w:after="0" w:before="0" w:line="210"/>
+              <w:jc w:val="center"/>
+            </w:pPr>
+            <w:r>
+              <w:rPr>
+                <w:rFonts w:ascii="Calibri" w:cs="Calibri" w:eastAsia="Calibri" w:hAnsi="Calibri"/>
+                <w:b/>
+                <w:bCs/>
+                <w:color w:val="C0392B"/>
+                <w:sz w:val="16"/>
+                <w:szCs w:val="16"/>
+              </w:rPr>
+              <w:t xml:space="preserve">Sem 17</w:t>
+            </w:r>
+            <w:r>
+              <w:rPr>
+                <w:rFonts w:ascii="Calibri" w:cs="Calibri" w:eastAsia="Calibri" w:hAnsi="Calibri"/>
+                <w:color w:val="6E6E6E"/>
+                <w:sz w:val="15"/>
+                <w:szCs w:val="15"/>
+              </w:rPr>
+              <w:t xml:space="preserve">   15/02</w:t>
+            </w:r>
+          </w:p>
+        </w:tc>
+        <w:tc>
+          <w:tcPr>
+            <w:tcW w:type="dxa" w:w="1927"/>
+            <w:shd w:fill="FFFFFF" w:color="auto" w:val="clear"/>
+            <w:tcMar>
+              <w:top w:type="dxa" w:w="45"/>
+              <w:left w:type="dxa" w:w="102"/>
+              <w:bottom w:type="dxa" w:w="45"/>
+              <w:right w:type="dxa" w:w="102"/>
+            </w:tcMar>
+            <w:vAlign w:val="center"/>
+          </w:tcPr>
+          <w:p>
+            <w:pPr>
+              <w:spacing w:after="0" w:before="0" w:line="210"/>
+            </w:pPr>
+            <w:r>
+              <w:rPr>
+                <w:rFonts w:ascii="Calibri" w:cs="Calibri" w:eastAsia="Calibri" w:hAnsi="Calibri"/>
+                <w:color w:val="2E2E2E"/>
+                <w:sz w:val="16"/>
+                <w:szCs w:val="16"/>
+              </w:rPr>
+              <w:t xml:space="preserve">Voir objectifs</w:t>
+            </w:r>
+          </w:p>
+        </w:tc>
+        <w:tc>
+          <w:tcPr>
+            <w:tcW w:type="dxa" w:w="1927"/>
+            <w:shd w:fill="FFFFFF" w:color="auto" w:val="clear"/>
+            <w:tcMar>
+              <w:top w:type="dxa" w:w="45"/>
+              <w:left w:type="dxa" w:w="102"/>
+              <w:bottom w:type="dxa" w:w="45"/>
+              <w:right w:type="dxa" w:w="102"/>
+            </w:tcMar>
+            <w:vAlign w:val="center"/>
+          </w:tcPr>
+          <w:p>
+            <w:pPr>
+              <w:spacing w:after="0" w:before="0" w:line="210"/>
+            </w:pPr>
+            <w:r>
+              <w:rPr>
+                <w:rFonts w:ascii="Calibri" w:cs="Calibri" w:eastAsia="Calibri" w:hAnsi="Calibri"/>
+                <w:color w:val="2E2E2E"/>
+                <w:sz w:val="16"/>
+                <w:szCs w:val="16"/>
+              </w:rPr>
+              <w:t xml:space="preserve">Voir objectifs</w:t>
+            </w:r>
+          </w:p>
+        </w:tc>
+        <w:tc>
+          <w:tcPr>
+            <w:tcW w:type="dxa" w:w="3174"/>
+            <w:shd w:fill="FFFFFF" w:color="auto" w:val="clear"/>
+            <w:tcMar>
+              <w:top w:type="dxa" w:w="45"/>
+              <w:left w:type="dxa" w:w="102"/>
+              <w:bottom w:type="dxa" w:w="45"/>
+              <w:right w:type="dxa" w:w="102"/>
+            </w:tcMar>
+            <w:vAlign w:val="center"/>
+          </w:tcPr>
+          <w:p>
+            <w:pPr>
+              <w:spacing w:after="0" w:before="0" w:line="210"/>
+            </w:pPr>
+            <w:r>
+              <w:rPr>
+                <w:rFonts w:ascii="Calibri" w:cs="Calibri" w:eastAsia="Calibri" w:hAnsi="Calibri"/>
+                <w:color w:val="2E2E2E"/>
+                <w:sz w:val="16"/>
+                <w:szCs w:val="16"/>
+              </w:rPr>
+              <w:t xml:space="preserve">Montée à la volée + service</w:t>
+            </w:r>
+          </w:p>
+        </w:tc>
+        <w:tc>
+          <w:tcPr>
+            <w:tcW w:type="dxa" w:w="3174"/>
+            <w:shd w:fill="FFFFFF" w:color="auto" w:val="clear"/>
+            <w:tcMar>
+              <w:top w:type="dxa" w:w="45"/>
+              <w:left w:type="dxa" w:w="102"/>
+              <w:bottom w:type="dxa" w:w="45"/>
+              <w:right w:type="dxa" w:w="102"/>
+            </w:tcMar>
+            <w:vAlign w:val="center"/>
+          </w:tcPr>
+          <w:p>
+            <w:pPr>
+              <w:spacing w:after="0" w:before="0" w:line="210"/>
+            </w:pPr>
+            <w:r>
+              <w:rPr>
+                <w:rFonts w:ascii="Calibri" w:cs="Calibri" w:eastAsia="Calibri" w:hAnsi="Calibri"/>
+                <w:color w:val="2E2E2E"/>
+                <w:sz w:val="16"/>
+                <w:szCs w:val="16"/>
+              </w:rPr>
+              <w:t xml:space="preserve">Montée à la volée + rappel volées</w:t>
+            </w:r>
+          </w:p>
+        </w:tc>
+        <w:tc>
+          <w:tcPr>
+            <w:tcW w:type="dxa" w:w="3401"/>
+            <w:shd w:fill="FFFFFF" w:color="auto" w:val="clear"/>
+            <w:tcMar>
+              <w:top w:type="dxa" w:w="45"/>
+              <w:left w:type="dxa" w:w="102"/>
+              <w:bottom w:type="dxa" w:w="45"/>
+              <w:right w:type="dxa" w:w="102"/>
+            </w:tcMar>
+            <w:vAlign w:val="center"/>
+          </w:tcPr>
+          <w:p>
+            <w:pPr>
+              <w:spacing w:after="0" w:before="0" w:line="210"/>
+            </w:pPr>
+            <w:r>
+              <w:rPr>
+                <w:rFonts w:ascii="Calibri" w:cs="Calibri" w:eastAsia="Calibri" w:hAnsi="Calibri"/>
+                <w:color w:val="2E2E2E"/>
+                <w:sz w:val="16"/>
+                <w:szCs w:val="16"/>
+              </w:rPr>
+              <w:t xml:space="preserve">Attaques</w:t>
             </w:r>
           </w:p>
         </w:tc>
@@ -3277,7 +3510,7 @@
                 <w:sz w:val="18"/>
                 <w:szCs w:val="18"/>
               </w:rPr>
-              <w:t xml:space="preserve">CARNAVAL — dates à confirmer</w:t>
+              <w:t xml:space="preserve">HIVER — du 21/02 au 07/03, pas de cours</w:t>
             </w:r>
           </w:p>
         </w:tc>
@@ -3312,7 +3545,16 @@
                 <w:sz w:val="16"/>
                 <w:szCs w:val="16"/>
               </w:rPr>
-              <w:t xml:space="preserve">Sem 17</w:t>
+              <w:t xml:space="preserve">Sem 18</w:t>
+            </w:r>
+            <w:r>
+              <w:rPr>
+                <w:rFonts w:ascii="Calibri" w:cs="Calibri" w:eastAsia="Calibri" w:hAnsi="Calibri"/>
+                <w:color w:val="6E6E6E"/>
+                <w:sz w:val="15"/>
+                <w:szCs w:val="15"/>
+              </w:rPr>
+              <w:t xml:space="preserve">   08/03</w:t>
             </w:r>
           </w:p>
         </w:tc>
@@ -3482,7 +3724,16 @@
                 <w:sz w:val="16"/>
                 <w:szCs w:val="16"/>
               </w:rPr>
-              <w:t xml:space="preserve">Sem 18</w:t>
+              <w:t xml:space="preserve">Sem 19</w:t>
+            </w:r>
+            <w:r>
+              <w:rPr>
+                <w:rFonts w:ascii="Calibri" w:cs="Calibri" w:eastAsia="Calibri" w:hAnsi="Calibri"/>
+                <w:color w:val="6E6E6E"/>
+                <w:sz w:val="15"/>
+                <w:szCs w:val="15"/>
+              </w:rPr>
+              <w:t xml:space="preserve">   15/03</w:t>
             </w:r>
           </w:p>
         </w:tc>
@@ -3563,7 +3814,7 @@
                 <w:sz w:val="16"/>
                 <w:szCs w:val="16"/>
               </w:rPr>
-              <w:t xml:space="preserve">Montée à la volée + service</w:t>
+              <w:t xml:space="preserve">Enchaîner les différentes actions</w:t>
             </w:r>
           </w:p>
         </w:tc>
@@ -3590,7 +3841,7 @@
                 <w:sz w:val="16"/>
                 <w:szCs w:val="16"/>
               </w:rPr>
-              <w:t xml:space="preserve">Montée à la volée + rappel volées</w:t>
+              <w:t xml:space="preserve">Enchaîner les différentes actions</w:t>
             </w:r>
           </w:p>
         </w:tc>
@@ -3617,7 +3868,7 @@
                 <w:sz w:val="16"/>
                 <w:szCs w:val="16"/>
               </w:rPr>
-              <w:t xml:space="preserve">Attaques</w:t>
+              <w:t xml:space="preserve">Inclure les attaques dans un schéma global</w:t>
             </w:r>
           </w:p>
         </w:tc>
@@ -3652,7 +3903,16 @@
                 <w:sz w:val="16"/>
                 <w:szCs w:val="16"/>
               </w:rPr>
-              <w:t xml:space="preserve">Sem 19</w:t>
+              <w:t xml:space="preserve">Sem 20</w:t>
+            </w:r>
+            <w:r>
+              <w:rPr>
+                <w:rFonts w:ascii="Calibri" w:cs="Calibri" w:eastAsia="Calibri" w:hAnsi="Calibri"/>
+                <w:color w:val="6E6E6E"/>
+                <w:sz w:val="15"/>
+                <w:szCs w:val="15"/>
+              </w:rPr>
+              <w:t xml:space="preserve">   22/03</w:t>
             </w:r>
           </w:p>
         </w:tc>
@@ -3706,7 +3966,7 @@
                 <w:sz w:val="16"/>
                 <w:szCs w:val="16"/>
               </w:rPr>
-              <w:t xml:space="preserve">Voir objectifs</w:t>
+              <w:t xml:space="preserve">Petit tournoi</w:t>
             </w:r>
           </w:p>
         </w:tc>
@@ -3733,7 +3993,7 @@
                 <w:sz w:val="16"/>
                 <w:szCs w:val="16"/>
               </w:rPr>
-              <w:t xml:space="preserve">Enchaîner les différentes actions</w:t>
+              <w:t xml:space="preserve">Doubles</w:t>
             </w:r>
           </w:p>
         </w:tc>
@@ -3760,7 +4020,7 @@
                 <w:sz w:val="16"/>
                 <w:szCs w:val="16"/>
               </w:rPr>
-              <w:t xml:space="preserve">Enchaîner les différentes actions</w:t>
+              <w:t xml:space="preserve">Doubles</w:t>
             </w:r>
           </w:p>
         </w:tc>
@@ -3787,7 +4047,43 @@
                 <w:sz w:val="16"/>
                 <w:szCs w:val="16"/>
               </w:rPr>
-              <w:t xml:space="preserve">Inclure les attaques dans un schéma global</w:t>
+              <w:t xml:space="preserve">Points – Matchs</w:t>
+            </w:r>
+          </w:p>
+        </w:tc>
+      </w:tr>
+      <w:tr>
+        <w:trPr>
+          <w:trHeight w:val="289" w:hRule="atLeast"/>
+        </w:trPr>
+        <w:tc>
+          <w:tcPr>
+            <w:tcW w:type="dxa" w:w="15133"/>
+            <w:gridSpan w:val="6"/>
+            <w:shd w:fill="F4F6EA" w:color="auto" w:val="clear"/>
+            <w:tcMar>
+              <w:top w:type="dxa" w:w="56"/>
+              <w:left w:type="dxa" w:w="113"/>
+              <w:bottom w:type="dxa" w:w="56"/>
+              <w:right w:type="dxa" w:w="113"/>
+            </w:tcMar>
+            <w:vAlign w:val="center"/>
+          </w:tcPr>
+          <w:p>
+            <w:pPr>
+              <w:spacing w:after="0" w:before="0" w:line="240"/>
+              <w:jc w:val="center"/>
+            </w:pPr>
+            <w:r>
+              <w:rPr>
+                <w:rFonts w:ascii="Calibri" w:cs="Calibri" w:eastAsia="Calibri" w:hAnsi="Calibri"/>
+                <w:b/>
+                <w:bCs/>
+                <w:color w:val="8A9E28"/>
+                <w:sz w:val="18"/>
+                <w:szCs w:val="18"/>
+              </w:rPr>
+              <w:t xml:space="preserve">PRINTEMPS — du 28/03 au 11/04, pas de cours</w:t>
             </w:r>
           </w:p>
         </w:tc>
@@ -3799,7 +4095,7 @@
         <w:tc>
           <w:tcPr>
             <w:tcW w:type="dxa" w:w="1530"/>
-            <w:shd w:fill="FAFAF6" w:color="auto" w:val="clear"/>
+            <w:shd w:fill="FFFFFF" w:color="auto" w:val="clear"/>
             <w:tcMar>
               <w:top w:type="dxa" w:w="45"/>
               <w:left w:type="dxa" w:w="102"/>
@@ -3822,14 +4118,23 @@
                 <w:sz w:val="16"/>
                 <w:szCs w:val="16"/>
               </w:rPr>
-              <w:t xml:space="preserve">Sem 20</w:t>
+              <w:t xml:space="preserve">Sem 21</w:t>
+            </w:r>
+            <w:r>
+              <w:rPr>
+                <w:rFonts w:ascii="Calibri" w:cs="Calibri" w:eastAsia="Calibri" w:hAnsi="Calibri"/>
+                <w:color w:val="6E6E6E"/>
+                <w:sz w:val="15"/>
+                <w:szCs w:val="15"/>
+              </w:rPr>
+              <w:t xml:space="preserve">   12/04</w:t>
             </w:r>
           </w:p>
         </w:tc>
         <w:tc>
           <w:tcPr>
             <w:tcW w:type="dxa" w:w="1927"/>
-            <w:shd w:fill="FAFAF6" w:color="auto" w:val="clear"/>
+            <w:shd w:fill="FFFFFF" w:color="auto" w:val="clear"/>
             <w:tcMar>
               <w:top w:type="dxa" w:w="45"/>
               <w:left w:type="dxa" w:w="102"/>
@@ -3856,113 +4161,1466 @@
         <w:tc>
           <w:tcPr>
             <w:tcW w:type="dxa" w:w="1927"/>
-            <w:shd w:fill="FAFAF6" w:color="auto" w:val="clear"/>
-            <w:tcMar>
-              <w:top w:type="dxa" w:w="45"/>
-              <w:left w:type="dxa" w:w="102"/>
-              <w:bottom w:type="dxa" w:w="45"/>
-              <w:right w:type="dxa" w:w="102"/>
-            </w:tcMar>
-            <w:vAlign w:val="center"/>
-          </w:tcPr>
-          <w:p>
-            <w:pPr>
-              <w:spacing w:after="0" w:before="0" w:line="210"/>
-            </w:pPr>
-            <w:r>
-              <w:rPr>
-                <w:rFonts w:ascii="Calibri" w:cs="Calibri" w:eastAsia="Calibri" w:hAnsi="Calibri"/>
-                <w:color w:val="2E2E2E"/>
-                <w:sz w:val="16"/>
-                <w:szCs w:val="16"/>
-              </w:rPr>
-              <w:t xml:space="preserve">Petit tournoi</w:t>
+            <w:shd w:fill="FFFFFF" w:color="auto" w:val="clear"/>
+            <w:tcMar>
+              <w:top w:type="dxa" w:w="45"/>
+              <w:left w:type="dxa" w:w="102"/>
+              <w:bottom w:type="dxa" w:w="45"/>
+              <w:right w:type="dxa" w:w="102"/>
+            </w:tcMar>
+            <w:vAlign w:val="center"/>
+          </w:tcPr>
+          <w:p>
+            <w:pPr>
+              <w:spacing w:after="0" w:before="0" w:line="210"/>
+            </w:pPr>
+            <w:r>
+              <w:rPr>
+                <w:rFonts w:ascii="Calibri" w:cs="Calibri" w:eastAsia="Calibri" w:hAnsi="Calibri"/>
+                <w:color w:val="2E2E2E"/>
+                <w:sz w:val="16"/>
+                <w:szCs w:val="16"/>
+              </w:rPr>
+              <w:t xml:space="preserve">Voir objectifs</w:t>
             </w:r>
           </w:p>
         </w:tc>
         <w:tc>
           <w:tcPr>
             <w:tcW w:type="dxa" w:w="3174"/>
-            <w:shd w:fill="FAFAF6" w:color="auto" w:val="clear"/>
-            <w:tcMar>
-              <w:top w:type="dxa" w:w="45"/>
-              <w:left w:type="dxa" w:w="102"/>
-              <w:bottom w:type="dxa" w:w="45"/>
-              <w:right w:type="dxa" w:w="102"/>
-            </w:tcMar>
-            <w:vAlign w:val="center"/>
-          </w:tcPr>
-          <w:p>
-            <w:pPr>
-              <w:spacing w:after="0" w:before="0" w:line="210"/>
-            </w:pPr>
-            <w:r>
-              <w:rPr>
-                <w:rFonts w:ascii="Calibri" w:cs="Calibri" w:eastAsia="Calibri" w:hAnsi="Calibri"/>
-                <w:color w:val="2E2E2E"/>
-                <w:sz w:val="16"/>
-                <w:szCs w:val="16"/>
-              </w:rPr>
-              <w:t xml:space="preserve">Doubles</w:t>
+            <w:shd w:fill="FFFFFF" w:color="auto" w:val="clear"/>
+            <w:tcMar>
+              <w:top w:type="dxa" w:w="45"/>
+              <w:left w:type="dxa" w:w="102"/>
+              <w:bottom w:type="dxa" w:w="45"/>
+              <w:right w:type="dxa" w:w="102"/>
+            </w:tcMar>
+            <w:vAlign w:val="center"/>
+          </w:tcPr>
+          <w:p>
+            <w:pPr>
+              <w:spacing w:after="0" w:before="0" w:line="210"/>
+            </w:pPr>
+            <w:r>
+              <w:rPr>
+                <w:rFonts w:ascii="Calibri" w:cs="Calibri" w:eastAsia="Calibri" w:hAnsi="Calibri"/>
+                <w:i/>
+                <w:iCs/>
+                <w:color w:val="9A9A9A"/>
+                <w:sz w:val="15"/>
+                <w:szCs w:val="15"/>
+              </w:rPr>
+              <w:t xml:space="preserve">À définir</w:t>
             </w:r>
           </w:p>
         </w:tc>
         <w:tc>
           <w:tcPr>
             <w:tcW w:type="dxa" w:w="3174"/>
-            <w:shd w:fill="FAFAF6" w:color="auto" w:val="clear"/>
-            <w:tcMar>
-              <w:top w:type="dxa" w:w="45"/>
-              <w:left w:type="dxa" w:w="102"/>
-              <w:bottom w:type="dxa" w:w="45"/>
-              <w:right w:type="dxa" w:w="102"/>
-            </w:tcMar>
-            <w:vAlign w:val="center"/>
-          </w:tcPr>
-          <w:p>
-            <w:pPr>
-              <w:spacing w:after="0" w:before="0" w:line="210"/>
-            </w:pPr>
-            <w:r>
-              <w:rPr>
-                <w:rFonts w:ascii="Calibri" w:cs="Calibri" w:eastAsia="Calibri" w:hAnsi="Calibri"/>
-                <w:color w:val="2E2E2E"/>
-                <w:sz w:val="16"/>
-                <w:szCs w:val="16"/>
-              </w:rPr>
-              <w:t xml:space="preserve">Doubles</w:t>
+            <w:shd w:fill="FFFFFF" w:color="auto" w:val="clear"/>
+            <w:tcMar>
+              <w:top w:type="dxa" w:w="45"/>
+              <w:left w:type="dxa" w:w="102"/>
+              <w:bottom w:type="dxa" w:w="45"/>
+              <w:right w:type="dxa" w:w="102"/>
+            </w:tcMar>
+            <w:vAlign w:val="center"/>
+          </w:tcPr>
+          <w:p>
+            <w:pPr>
+              <w:spacing w:after="0" w:before="0" w:line="210"/>
+            </w:pPr>
+            <w:r>
+              <w:rPr>
+                <w:rFonts w:ascii="Calibri" w:cs="Calibri" w:eastAsia="Calibri" w:hAnsi="Calibri"/>
+                <w:i/>
+                <w:iCs/>
+                <w:color w:val="9A9A9A"/>
+                <w:sz w:val="15"/>
+                <w:szCs w:val="15"/>
+              </w:rPr>
+              <w:t xml:space="preserve">À définir</w:t>
             </w:r>
           </w:p>
         </w:tc>
         <w:tc>
           <w:tcPr>
             <w:tcW w:type="dxa" w:w="3401"/>
-            <w:shd w:fill="FAFAF6" w:color="auto" w:val="clear"/>
-            <w:tcMar>
-              <w:top w:type="dxa" w:w="45"/>
-              <w:left w:type="dxa" w:w="102"/>
-              <w:bottom w:type="dxa" w:w="45"/>
-              <w:right w:type="dxa" w:w="102"/>
-            </w:tcMar>
-            <w:vAlign w:val="center"/>
-          </w:tcPr>
-          <w:p>
-            <w:pPr>
-              <w:spacing w:after="0" w:before="0" w:line="210"/>
-            </w:pPr>
-            <w:r>
-              <w:rPr>
-                <w:rFonts w:ascii="Calibri" w:cs="Calibri" w:eastAsia="Calibri" w:hAnsi="Calibri"/>
-                <w:color w:val="2E2E2E"/>
-                <w:sz w:val="16"/>
-                <w:szCs w:val="16"/>
-              </w:rPr>
-              <w:t xml:space="preserve">Points – Matchs</w:t>
+            <w:shd w:fill="FFFFFF" w:color="auto" w:val="clear"/>
+            <w:tcMar>
+              <w:top w:type="dxa" w:w="45"/>
+              <w:left w:type="dxa" w:w="102"/>
+              <w:bottom w:type="dxa" w:w="45"/>
+              <w:right w:type="dxa" w:w="102"/>
+            </w:tcMar>
+            <w:vAlign w:val="center"/>
+          </w:tcPr>
+          <w:p>
+            <w:pPr>
+              <w:spacing w:after="0" w:before="0" w:line="210"/>
+            </w:pPr>
+            <w:r>
+              <w:rPr>
+                <w:rFonts w:ascii="Calibri" w:cs="Calibri" w:eastAsia="Calibri" w:hAnsi="Calibri"/>
+                <w:i/>
+                <w:iCs/>
+                <w:color w:val="9A9A9A"/>
+                <w:sz w:val="15"/>
+                <w:szCs w:val="15"/>
+              </w:rPr>
+              <w:t xml:space="preserve">À définir</w:t>
+            </w:r>
+          </w:p>
+        </w:tc>
+      </w:tr>
+      <w:tr>
+        <w:trPr>
+          <w:trHeight w:val="334" w:hRule="atLeast"/>
+        </w:trPr>
+        <w:tc>
+          <w:tcPr>
+            <w:tcW w:type="dxa" w:w="1530"/>
+            <w:shd w:fill="FAFAF6" w:color="auto" w:val="clear"/>
+            <w:tcMar>
+              <w:top w:type="dxa" w:w="45"/>
+              <w:left w:type="dxa" w:w="102"/>
+              <w:bottom w:type="dxa" w:w="45"/>
+              <w:right w:type="dxa" w:w="102"/>
+            </w:tcMar>
+            <w:vAlign w:val="center"/>
+          </w:tcPr>
+          <w:p>
+            <w:pPr>
+              <w:spacing w:after="0" w:before="0" w:line="210"/>
+              <w:jc w:val="center"/>
+            </w:pPr>
+            <w:r>
+              <w:rPr>
+                <w:rFonts w:ascii="Calibri" w:cs="Calibri" w:eastAsia="Calibri" w:hAnsi="Calibri"/>
+                <w:b/>
+                <w:bCs/>
+                <w:color w:val="C0392B"/>
+                <w:sz w:val="16"/>
+                <w:szCs w:val="16"/>
+              </w:rPr>
+              <w:t xml:space="preserve">Sem 22</w:t>
+            </w:r>
+            <w:r>
+              <w:rPr>
+                <w:rFonts w:ascii="Calibri" w:cs="Calibri" w:eastAsia="Calibri" w:hAnsi="Calibri"/>
+                <w:color w:val="6E6E6E"/>
+                <w:sz w:val="15"/>
+                <w:szCs w:val="15"/>
+              </w:rPr>
+              <w:t xml:space="preserve">   19/04</w:t>
+            </w:r>
+          </w:p>
+        </w:tc>
+        <w:tc>
+          <w:tcPr>
+            <w:tcW w:type="dxa" w:w="1927"/>
+            <w:shd w:fill="FAFAF6" w:color="auto" w:val="clear"/>
+            <w:tcMar>
+              <w:top w:type="dxa" w:w="45"/>
+              <w:left w:type="dxa" w:w="102"/>
+              <w:bottom w:type="dxa" w:w="45"/>
+              <w:right w:type="dxa" w:w="102"/>
+            </w:tcMar>
+            <w:vAlign w:val="center"/>
+          </w:tcPr>
+          <w:p>
+            <w:pPr>
+              <w:spacing w:after="0" w:before="0" w:line="210"/>
+            </w:pPr>
+            <w:r>
+              <w:rPr>
+                <w:rFonts w:ascii="Calibri" w:cs="Calibri" w:eastAsia="Calibri" w:hAnsi="Calibri"/>
+                <w:color w:val="2E2E2E"/>
+                <w:sz w:val="16"/>
+                <w:szCs w:val="16"/>
+              </w:rPr>
+              <w:t xml:space="preserve">Voir objectifs</w:t>
+            </w:r>
+          </w:p>
+        </w:tc>
+        <w:tc>
+          <w:tcPr>
+            <w:tcW w:type="dxa" w:w="1927"/>
+            <w:shd w:fill="FAFAF6" w:color="auto" w:val="clear"/>
+            <w:tcMar>
+              <w:top w:type="dxa" w:w="45"/>
+              <w:left w:type="dxa" w:w="102"/>
+              <w:bottom w:type="dxa" w:w="45"/>
+              <w:right w:type="dxa" w:w="102"/>
+            </w:tcMar>
+            <w:vAlign w:val="center"/>
+          </w:tcPr>
+          <w:p>
+            <w:pPr>
+              <w:spacing w:after="0" w:before="0" w:line="210"/>
+            </w:pPr>
+            <w:r>
+              <w:rPr>
+                <w:rFonts w:ascii="Calibri" w:cs="Calibri" w:eastAsia="Calibri" w:hAnsi="Calibri"/>
+                <w:color w:val="2E2E2E"/>
+                <w:sz w:val="16"/>
+                <w:szCs w:val="16"/>
+              </w:rPr>
+              <w:t xml:space="preserve">Voir objectifs</w:t>
+            </w:r>
+          </w:p>
+        </w:tc>
+        <w:tc>
+          <w:tcPr>
+            <w:tcW w:type="dxa" w:w="3174"/>
+            <w:shd w:fill="FAFAF6" w:color="auto" w:val="clear"/>
+            <w:tcMar>
+              <w:top w:type="dxa" w:w="45"/>
+              <w:left w:type="dxa" w:w="102"/>
+              <w:bottom w:type="dxa" w:w="45"/>
+              <w:right w:type="dxa" w:w="102"/>
+            </w:tcMar>
+            <w:vAlign w:val="center"/>
+          </w:tcPr>
+          <w:p>
+            <w:pPr>
+              <w:spacing w:after="0" w:before="0" w:line="210"/>
+            </w:pPr>
+            <w:r>
+              <w:rPr>
+                <w:rFonts w:ascii="Calibri" w:cs="Calibri" w:eastAsia="Calibri" w:hAnsi="Calibri"/>
+                <w:i/>
+                <w:iCs/>
+                <w:color w:val="9A9A9A"/>
+                <w:sz w:val="15"/>
+                <w:szCs w:val="15"/>
+              </w:rPr>
+              <w:t xml:space="preserve">À définir</w:t>
+            </w:r>
+          </w:p>
+        </w:tc>
+        <w:tc>
+          <w:tcPr>
+            <w:tcW w:type="dxa" w:w="3174"/>
+            <w:shd w:fill="FAFAF6" w:color="auto" w:val="clear"/>
+            <w:tcMar>
+              <w:top w:type="dxa" w:w="45"/>
+              <w:left w:type="dxa" w:w="102"/>
+              <w:bottom w:type="dxa" w:w="45"/>
+              <w:right w:type="dxa" w:w="102"/>
+            </w:tcMar>
+            <w:vAlign w:val="center"/>
+          </w:tcPr>
+          <w:p>
+            <w:pPr>
+              <w:spacing w:after="0" w:before="0" w:line="210"/>
+            </w:pPr>
+            <w:r>
+              <w:rPr>
+                <w:rFonts w:ascii="Calibri" w:cs="Calibri" w:eastAsia="Calibri" w:hAnsi="Calibri"/>
+                <w:i/>
+                <w:iCs/>
+                <w:color w:val="9A9A9A"/>
+                <w:sz w:val="15"/>
+                <w:szCs w:val="15"/>
+              </w:rPr>
+              <w:t xml:space="preserve">À définir</w:t>
+            </w:r>
+          </w:p>
+        </w:tc>
+        <w:tc>
+          <w:tcPr>
+            <w:tcW w:type="dxa" w:w="3401"/>
+            <w:shd w:fill="FAFAF6" w:color="auto" w:val="clear"/>
+            <w:tcMar>
+              <w:top w:type="dxa" w:w="45"/>
+              <w:left w:type="dxa" w:w="102"/>
+              <w:bottom w:type="dxa" w:w="45"/>
+              <w:right w:type="dxa" w:w="102"/>
+            </w:tcMar>
+            <w:vAlign w:val="center"/>
+          </w:tcPr>
+          <w:p>
+            <w:pPr>
+              <w:spacing w:after="0" w:before="0" w:line="210"/>
+            </w:pPr>
+            <w:r>
+              <w:rPr>
+                <w:rFonts w:ascii="Calibri" w:cs="Calibri" w:eastAsia="Calibri" w:hAnsi="Calibri"/>
+                <w:i/>
+                <w:iCs/>
+                <w:color w:val="9A9A9A"/>
+                <w:sz w:val="15"/>
+                <w:szCs w:val="15"/>
+              </w:rPr>
+              <w:t xml:space="preserve">À définir</w:t>
+            </w:r>
+          </w:p>
+        </w:tc>
+      </w:tr>
+      <w:tr>
+        <w:trPr>
+          <w:trHeight w:val="289" w:hRule="atLeast"/>
+        </w:trPr>
+        <w:tc>
+          <w:tcPr>
+            <w:tcW w:type="dxa" w:w="15133"/>
+            <w:gridSpan w:val="6"/>
+            <w:shd w:fill="F4F6EA" w:color="auto" w:val="clear"/>
+            <w:tcMar>
+              <w:top w:type="dxa" w:w="56"/>
+              <w:left w:type="dxa" w:w="113"/>
+              <w:bottom w:type="dxa" w:w="56"/>
+              <w:right w:type="dxa" w:w="113"/>
+            </w:tcMar>
+            <w:vAlign w:val="center"/>
+          </w:tcPr>
+          <w:p>
+            <w:pPr>
+              <w:spacing w:after="0" w:before="0" w:line="240"/>
+              <w:jc w:val="center"/>
+            </w:pPr>
+            <w:r>
+              <w:rPr>
+                <w:rFonts w:ascii="Calibri" w:cs="Calibri" w:eastAsia="Calibri" w:hAnsi="Calibri"/>
+                <w:b/>
+                <w:bCs/>
+                <w:color w:val="8A9E28"/>
+                <w:sz w:val="18"/>
+                <w:szCs w:val="18"/>
+              </w:rPr>
+              <w:t xml:space="preserve">MAI — du 25/04 au 09/05, pas de cours</w:t>
+            </w:r>
+          </w:p>
+        </w:tc>
+      </w:tr>
+      <w:tr>
+        <w:trPr>
+          <w:trHeight w:val="334" w:hRule="atLeast"/>
+        </w:trPr>
+        <w:tc>
+          <w:tcPr>
+            <w:tcW w:type="dxa" w:w="1530"/>
+            <w:shd w:fill="FFFFFF" w:color="auto" w:val="clear"/>
+            <w:tcMar>
+              <w:top w:type="dxa" w:w="45"/>
+              <w:left w:type="dxa" w:w="102"/>
+              <w:bottom w:type="dxa" w:w="45"/>
+              <w:right w:type="dxa" w:w="102"/>
+            </w:tcMar>
+            <w:vAlign w:val="center"/>
+          </w:tcPr>
+          <w:p>
+            <w:pPr>
+              <w:spacing w:after="0" w:before="0" w:line="210"/>
+              <w:jc w:val="center"/>
+            </w:pPr>
+            <w:r>
+              <w:rPr>
+                <w:rFonts w:ascii="Calibri" w:cs="Calibri" w:eastAsia="Calibri" w:hAnsi="Calibri"/>
+                <w:b/>
+                <w:bCs/>
+                <w:color w:val="C0392B"/>
+                <w:sz w:val="16"/>
+                <w:szCs w:val="16"/>
+              </w:rPr>
+              <w:t xml:space="preserve">Sem 23</w:t>
+            </w:r>
+            <w:r>
+              <w:rPr>
+                <w:rFonts w:ascii="Calibri" w:cs="Calibri" w:eastAsia="Calibri" w:hAnsi="Calibri"/>
+                <w:color w:val="6E6E6E"/>
+                <w:sz w:val="15"/>
+                <w:szCs w:val="15"/>
+              </w:rPr>
+              <w:t xml:space="preserve">   10/05</w:t>
+            </w:r>
+          </w:p>
+        </w:tc>
+        <w:tc>
+          <w:tcPr>
+            <w:tcW w:type="dxa" w:w="1927"/>
+            <w:shd w:fill="FFFFFF" w:color="auto" w:val="clear"/>
+            <w:tcMar>
+              <w:top w:type="dxa" w:w="45"/>
+              <w:left w:type="dxa" w:w="102"/>
+              <w:bottom w:type="dxa" w:w="45"/>
+              <w:right w:type="dxa" w:w="102"/>
+            </w:tcMar>
+            <w:vAlign w:val="center"/>
+          </w:tcPr>
+          <w:p>
+            <w:pPr>
+              <w:spacing w:after="0" w:before="0" w:line="210"/>
+            </w:pPr>
+            <w:r>
+              <w:rPr>
+                <w:rFonts w:ascii="Calibri" w:cs="Calibri" w:eastAsia="Calibri" w:hAnsi="Calibri"/>
+                <w:color w:val="2E2E2E"/>
+                <w:sz w:val="16"/>
+                <w:szCs w:val="16"/>
+              </w:rPr>
+              <w:t xml:space="preserve">Voir objectifs</w:t>
+            </w:r>
+          </w:p>
+        </w:tc>
+        <w:tc>
+          <w:tcPr>
+            <w:tcW w:type="dxa" w:w="1927"/>
+            <w:shd w:fill="FFFFFF" w:color="auto" w:val="clear"/>
+            <w:tcMar>
+              <w:top w:type="dxa" w:w="45"/>
+              <w:left w:type="dxa" w:w="102"/>
+              <w:bottom w:type="dxa" w:w="45"/>
+              <w:right w:type="dxa" w:w="102"/>
+            </w:tcMar>
+            <w:vAlign w:val="center"/>
+          </w:tcPr>
+          <w:p>
+            <w:pPr>
+              <w:spacing w:after="0" w:before="0" w:line="210"/>
+            </w:pPr>
+            <w:r>
+              <w:rPr>
+                <w:rFonts w:ascii="Calibri" w:cs="Calibri" w:eastAsia="Calibri" w:hAnsi="Calibri"/>
+                <w:color w:val="2E2E2E"/>
+                <w:sz w:val="16"/>
+                <w:szCs w:val="16"/>
+              </w:rPr>
+              <w:t xml:space="preserve">Voir objectifs</w:t>
+            </w:r>
+          </w:p>
+        </w:tc>
+        <w:tc>
+          <w:tcPr>
+            <w:tcW w:type="dxa" w:w="3174"/>
+            <w:shd w:fill="FFFFFF" w:color="auto" w:val="clear"/>
+            <w:tcMar>
+              <w:top w:type="dxa" w:w="45"/>
+              <w:left w:type="dxa" w:w="102"/>
+              <w:bottom w:type="dxa" w:w="45"/>
+              <w:right w:type="dxa" w:w="102"/>
+            </w:tcMar>
+            <w:vAlign w:val="center"/>
+          </w:tcPr>
+          <w:p>
+            <w:pPr>
+              <w:spacing w:after="0" w:before="0" w:line="210"/>
+            </w:pPr>
+            <w:r>
+              <w:rPr>
+                <w:rFonts w:ascii="Calibri" w:cs="Calibri" w:eastAsia="Calibri" w:hAnsi="Calibri"/>
+                <w:i/>
+                <w:iCs/>
+                <w:color w:val="9A9A9A"/>
+                <w:sz w:val="15"/>
+                <w:szCs w:val="15"/>
+              </w:rPr>
+              <w:t xml:space="preserve">À définir</w:t>
+            </w:r>
+          </w:p>
+        </w:tc>
+        <w:tc>
+          <w:tcPr>
+            <w:tcW w:type="dxa" w:w="3174"/>
+            <w:shd w:fill="FFFFFF" w:color="auto" w:val="clear"/>
+            <w:tcMar>
+              <w:top w:type="dxa" w:w="45"/>
+              <w:left w:type="dxa" w:w="102"/>
+              <w:bottom w:type="dxa" w:w="45"/>
+              <w:right w:type="dxa" w:w="102"/>
+            </w:tcMar>
+            <w:vAlign w:val="center"/>
+          </w:tcPr>
+          <w:p>
+            <w:pPr>
+              <w:spacing w:after="0" w:before="0" w:line="210"/>
+            </w:pPr>
+            <w:r>
+              <w:rPr>
+                <w:rFonts w:ascii="Calibri" w:cs="Calibri" w:eastAsia="Calibri" w:hAnsi="Calibri"/>
+                <w:i/>
+                <w:iCs/>
+                <w:color w:val="9A9A9A"/>
+                <w:sz w:val="15"/>
+                <w:szCs w:val="15"/>
+              </w:rPr>
+              <w:t xml:space="preserve">À définir</w:t>
+            </w:r>
+          </w:p>
+        </w:tc>
+        <w:tc>
+          <w:tcPr>
+            <w:tcW w:type="dxa" w:w="3401"/>
+            <w:shd w:fill="FFFFFF" w:color="auto" w:val="clear"/>
+            <w:tcMar>
+              <w:top w:type="dxa" w:w="45"/>
+              <w:left w:type="dxa" w:w="102"/>
+              <w:bottom w:type="dxa" w:w="45"/>
+              <w:right w:type="dxa" w:w="102"/>
+            </w:tcMar>
+            <w:vAlign w:val="center"/>
+          </w:tcPr>
+          <w:p>
+            <w:pPr>
+              <w:spacing w:after="0" w:before="0" w:line="210"/>
+            </w:pPr>
+            <w:r>
+              <w:rPr>
+                <w:rFonts w:ascii="Calibri" w:cs="Calibri" w:eastAsia="Calibri" w:hAnsi="Calibri"/>
+                <w:i/>
+                <w:iCs/>
+                <w:color w:val="9A9A9A"/>
+                <w:sz w:val="15"/>
+                <w:szCs w:val="15"/>
+              </w:rPr>
+              <w:t xml:space="preserve">À définir</w:t>
+            </w:r>
+          </w:p>
+        </w:tc>
+      </w:tr>
+      <w:tr>
+        <w:trPr>
+          <w:trHeight w:val="334" w:hRule="atLeast"/>
+        </w:trPr>
+        <w:tc>
+          <w:tcPr>
+            <w:tcW w:type="dxa" w:w="1530"/>
+            <w:shd w:fill="FAFAF6" w:color="auto" w:val="clear"/>
+            <w:tcMar>
+              <w:top w:type="dxa" w:w="45"/>
+              <w:left w:type="dxa" w:w="102"/>
+              <w:bottom w:type="dxa" w:w="45"/>
+              <w:right w:type="dxa" w:w="102"/>
+            </w:tcMar>
+            <w:vAlign w:val="center"/>
+          </w:tcPr>
+          <w:p>
+            <w:pPr>
+              <w:spacing w:after="0" w:before="0" w:line="210"/>
+              <w:jc w:val="center"/>
+            </w:pPr>
+            <w:r>
+              <w:rPr>
+                <w:rFonts w:ascii="Calibri" w:cs="Calibri" w:eastAsia="Calibri" w:hAnsi="Calibri"/>
+                <w:b/>
+                <w:bCs/>
+                <w:color w:val="C0392B"/>
+                <w:sz w:val="16"/>
+                <w:szCs w:val="16"/>
+              </w:rPr>
+              <w:t xml:space="preserve">Sem 24</w:t>
+            </w:r>
+            <w:r>
+              <w:rPr>
+                <w:rFonts w:ascii="Calibri" w:cs="Calibri" w:eastAsia="Calibri" w:hAnsi="Calibri"/>
+                <w:color w:val="6E6E6E"/>
+                <w:sz w:val="15"/>
+                <w:szCs w:val="15"/>
+              </w:rPr>
+              <w:t xml:space="preserve">   17/05</w:t>
+            </w:r>
+          </w:p>
+        </w:tc>
+        <w:tc>
+          <w:tcPr>
+            <w:tcW w:type="dxa" w:w="1927"/>
+            <w:shd w:fill="FAFAF6" w:color="auto" w:val="clear"/>
+            <w:tcMar>
+              <w:top w:type="dxa" w:w="45"/>
+              <w:left w:type="dxa" w:w="102"/>
+              <w:bottom w:type="dxa" w:w="45"/>
+              <w:right w:type="dxa" w:w="102"/>
+            </w:tcMar>
+            <w:vAlign w:val="center"/>
+          </w:tcPr>
+          <w:p>
+            <w:pPr>
+              <w:spacing w:after="0" w:before="0" w:line="210"/>
+            </w:pPr>
+            <w:r>
+              <w:rPr>
+                <w:rFonts w:ascii="Calibri" w:cs="Calibri" w:eastAsia="Calibri" w:hAnsi="Calibri"/>
+                <w:color w:val="2E2E2E"/>
+                <w:sz w:val="16"/>
+                <w:szCs w:val="16"/>
+              </w:rPr>
+              <w:t xml:space="preserve">Voir objectifs</w:t>
+            </w:r>
+          </w:p>
+        </w:tc>
+        <w:tc>
+          <w:tcPr>
+            <w:tcW w:type="dxa" w:w="1927"/>
+            <w:shd w:fill="FAFAF6" w:color="auto" w:val="clear"/>
+            <w:tcMar>
+              <w:top w:type="dxa" w:w="45"/>
+              <w:left w:type="dxa" w:w="102"/>
+              <w:bottom w:type="dxa" w:w="45"/>
+              <w:right w:type="dxa" w:w="102"/>
+            </w:tcMar>
+            <w:vAlign w:val="center"/>
+          </w:tcPr>
+          <w:p>
+            <w:pPr>
+              <w:spacing w:after="0" w:before="0" w:line="210"/>
+            </w:pPr>
+            <w:r>
+              <w:rPr>
+                <w:rFonts w:ascii="Calibri" w:cs="Calibri" w:eastAsia="Calibri" w:hAnsi="Calibri"/>
+                <w:color w:val="2E2E2E"/>
+                <w:sz w:val="16"/>
+                <w:szCs w:val="16"/>
+              </w:rPr>
+              <w:t xml:space="preserve">Voir objectifs</w:t>
+            </w:r>
+          </w:p>
+        </w:tc>
+        <w:tc>
+          <w:tcPr>
+            <w:tcW w:type="dxa" w:w="3174"/>
+            <w:shd w:fill="FAFAF6" w:color="auto" w:val="clear"/>
+            <w:tcMar>
+              <w:top w:type="dxa" w:w="45"/>
+              <w:left w:type="dxa" w:w="102"/>
+              <w:bottom w:type="dxa" w:w="45"/>
+              <w:right w:type="dxa" w:w="102"/>
+            </w:tcMar>
+            <w:vAlign w:val="center"/>
+          </w:tcPr>
+          <w:p>
+            <w:pPr>
+              <w:spacing w:after="0" w:before="0" w:line="210"/>
+            </w:pPr>
+            <w:r>
+              <w:rPr>
+                <w:rFonts w:ascii="Calibri" w:cs="Calibri" w:eastAsia="Calibri" w:hAnsi="Calibri"/>
+                <w:i/>
+                <w:iCs/>
+                <w:color w:val="9A9A9A"/>
+                <w:sz w:val="15"/>
+                <w:szCs w:val="15"/>
+              </w:rPr>
+              <w:t xml:space="preserve">À définir</w:t>
+            </w:r>
+          </w:p>
+        </w:tc>
+        <w:tc>
+          <w:tcPr>
+            <w:tcW w:type="dxa" w:w="3174"/>
+            <w:shd w:fill="FAFAF6" w:color="auto" w:val="clear"/>
+            <w:tcMar>
+              <w:top w:type="dxa" w:w="45"/>
+              <w:left w:type="dxa" w:w="102"/>
+              <w:bottom w:type="dxa" w:w="45"/>
+              <w:right w:type="dxa" w:w="102"/>
+            </w:tcMar>
+            <w:vAlign w:val="center"/>
+          </w:tcPr>
+          <w:p>
+            <w:pPr>
+              <w:spacing w:after="0" w:before="0" w:line="210"/>
+            </w:pPr>
+            <w:r>
+              <w:rPr>
+                <w:rFonts w:ascii="Calibri" w:cs="Calibri" w:eastAsia="Calibri" w:hAnsi="Calibri"/>
+                <w:i/>
+                <w:iCs/>
+                <w:color w:val="9A9A9A"/>
+                <w:sz w:val="15"/>
+                <w:szCs w:val="15"/>
+              </w:rPr>
+              <w:t xml:space="preserve">À définir</w:t>
+            </w:r>
+          </w:p>
+        </w:tc>
+        <w:tc>
+          <w:tcPr>
+            <w:tcW w:type="dxa" w:w="3401"/>
+            <w:shd w:fill="FAFAF6" w:color="auto" w:val="clear"/>
+            <w:tcMar>
+              <w:top w:type="dxa" w:w="45"/>
+              <w:left w:type="dxa" w:w="102"/>
+              <w:bottom w:type="dxa" w:w="45"/>
+              <w:right w:type="dxa" w:w="102"/>
+            </w:tcMar>
+            <w:vAlign w:val="center"/>
+          </w:tcPr>
+          <w:p>
+            <w:pPr>
+              <w:spacing w:after="0" w:before="0" w:line="210"/>
+            </w:pPr>
+            <w:r>
+              <w:rPr>
+                <w:rFonts w:ascii="Calibri" w:cs="Calibri" w:eastAsia="Calibri" w:hAnsi="Calibri"/>
+                <w:i/>
+                <w:iCs/>
+                <w:color w:val="9A9A9A"/>
+                <w:sz w:val="15"/>
+                <w:szCs w:val="15"/>
+              </w:rPr>
+              <w:t xml:space="preserve">À définir</w:t>
+            </w:r>
+          </w:p>
+        </w:tc>
+      </w:tr>
+      <w:tr>
+        <w:trPr>
+          <w:trHeight w:val="334" w:hRule="atLeast"/>
+        </w:trPr>
+        <w:tc>
+          <w:tcPr>
+            <w:tcW w:type="dxa" w:w="1530"/>
+            <w:shd w:fill="FFFFFF" w:color="auto" w:val="clear"/>
+            <w:tcMar>
+              <w:top w:type="dxa" w:w="45"/>
+              <w:left w:type="dxa" w:w="102"/>
+              <w:bottom w:type="dxa" w:w="45"/>
+              <w:right w:type="dxa" w:w="102"/>
+            </w:tcMar>
+            <w:vAlign w:val="center"/>
+          </w:tcPr>
+          <w:p>
+            <w:pPr>
+              <w:spacing w:after="0" w:before="0" w:line="210"/>
+              <w:jc w:val="center"/>
+            </w:pPr>
+            <w:r>
+              <w:rPr>
+                <w:rFonts w:ascii="Calibri" w:cs="Calibri" w:eastAsia="Calibri" w:hAnsi="Calibri"/>
+                <w:b/>
+                <w:bCs/>
+                <w:color w:val="C0392B"/>
+                <w:sz w:val="16"/>
+                <w:szCs w:val="16"/>
+              </w:rPr>
+              <w:t xml:space="preserve">Sem 25</w:t>
+            </w:r>
+            <w:r>
+              <w:rPr>
+                <w:rFonts w:ascii="Calibri" w:cs="Calibri" w:eastAsia="Calibri" w:hAnsi="Calibri"/>
+                <w:color w:val="6E6E6E"/>
+                <w:sz w:val="15"/>
+                <w:szCs w:val="15"/>
+              </w:rPr>
+              <w:t xml:space="preserve">   24/05</w:t>
+            </w:r>
+          </w:p>
+        </w:tc>
+        <w:tc>
+          <w:tcPr>
+            <w:tcW w:type="dxa" w:w="1927"/>
+            <w:shd w:fill="FFFFFF" w:color="auto" w:val="clear"/>
+            <w:tcMar>
+              <w:top w:type="dxa" w:w="45"/>
+              <w:left w:type="dxa" w:w="102"/>
+              <w:bottom w:type="dxa" w:w="45"/>
+              <w:right w:type="dxa" w:w="102"/>
+            </w:tcMar>
+            <w:vAlign w:val="center"/>
+          </w:tcPr>
+          <w:p>
+            <w:pPr>
+              <w:spacing w:after="0" w:before="0" w:line="210"/>
+            </w:pPr>
+            <w:r>
+              <w:rPr>
+                <w:rFonts w:ascii="Calibri" w:cs="Calibri" w:eastAsia="Calibri" w:hAnsi="Calibri"/>
+                <w:color w:val="2E2E2E"/>
+                <w:sz w:val="16"/>
+                <w:szCs w:val="16"/>
+              </w:rPr>
+              <w:t xml:space="preserve">Voir objectifs</w:t>
+            </w:r>
+          </w:p>
+        </w:tc>
+        <w:tc>
+          <w:tcPr>
+            <w:tcW w:type="dxa" w:w="1927"/>
+            <w:shd w:fill="FFFFFF" w:color="auto" w:val="clear"/>
+            <w:tcMar>
+              <w:top w:type="dxa" w:w="45"/>
+              <w:left w:type="dxa" w:w="102"/>
+              <w:bottom w:type="dxa" w:w="45"/>
+              <w:right w:type="dxa" w:w="102"/>
+            </w:tcMar>
+            <w:vAlign w:val="center"/>
+          </w:tcPr>
+          <w:p>
+            <w:pPr>
+              <w:spacing w:after="0" w:before="0" w:line="210"/>
+            </w:pPr>
+            <w:r>
+              <w:rPr>
+                <w:rFonts w:ascii="Calibri" w:cs="Calibri" w:eastAsia="Calibri" w:hAnsi="Calibri"/>
+                <w:color w:val="2E2E2E"/>
+                <w:sz w:val="16"/>
+                <w:szCs w:val="16"/>
+              </w:rPr>
+              <w:t xml:space="preserve">Voir objectifs</w:t>
+            </w:r>
+          </w:p>
+        </w:tc>
+        <w:tc>
+          <w:tcPr>
+            <w:tcW w:type="dxa" w:w="3174"/>
+            <w:shd w:fill="FFFFFF" w:color="auto" w:val="clear"/>
+            <w:tcMar>
+              <w:top w:type="dxa" w:w="45"/>
+              <w:left w:type="dxa" w:w="102"/>
+              <w:bottom w:type="dxa" w:w="45"/>
+              <w:right w:type="dxa" w:w="102"/>
+            </w:tcMar>
+            <w:vAlign w:val="center"/>
+          </w:tcPr>
+          <w:p>
+            <w:pPr>
+              <w:spacing w:after="0" w:before="0" w:line="210"/>
+            </w:pPr>
+            <w:r>
+              <w:rPr>
+                <w:rFonts w:ascii="Calibri" w:cs="Calibri" w:eastAsia="Calibri" w:hAnsi="Calibri"/>
+                <w:i/>
+                <w:iCs/>
+                <w:color w:val="9A9A9A"/>
+                <w:sz w:val="15"/>
+                <w:szCs w:val="15"/>
+              </w:rPr>
+              <w:t xml:space="preserve">À définir</w:t>
+            </w:r>
+          </w:p>
+        </w:tc>
+        <w:tc>
+          <w:tcPr>
+            <w:tcW w:type="dxa" w:w="3174"/>
+            <w:shd w:fill="FFFFFF" w:color="auto" w:val="clear"/>
+            <w:tcMar>
+              <w:top w:type="dxa" w:w="45"/>
+              <w:left w:type="dxa" w:w="102"/>
+              <w:bottom w:type="dxa" w:w="45"/>
+              <w:right w:type="dxa" w:w="102"/>
+            </w:tcMar>
+            <w:vAlign w:val="center"/>
+          </w:tcPr>
+          <w:p>
+            <w:pPr>
+              <w:spacing w:after="0" w:before="0" w:line="210"/>
+            </w:pPr>
+            <w:r>
+              <w:rPr>
+                <w:rFonts w:ascii="Calibri" w:cs="Calibri" w:eastAsia="Calibri" w:hAnsi="Calibri"/>
+                <w:i/>
+                <w:iCs/>
+                <w:color w:val="9A9A9A"/>
+                <w:sz w:val="15"/>
+                <w:szCs w:val="15"/>
+              </w:rPr>
+              <w:t xml:space="preserve">À définir</w:t>
+            </w:r>
+          </w:p>
+        </w:tc>
+        <w:tc>
+          <w:tcPr>
+            <w:tcW w:type="dxa" w:w="3401"/>
+            <w:shd w:fill="FFFFFF" w:color="auto" w:val="clear"/>
+            <w:tcMar>
+              <w:top w:type="dxa" w:w="45"/>
+              <w:left w:type="dxa" w:w="102"/>
+              <w:bottom w:type="dxa" w:w="45"/>
+              <w:right w:type="dxa" w:w="102"/>
+            </w:tcMar>
+            <w:vAlign w:val="center"/>
+          </w:tcPr>
+          <w:p>
+            <w:pPr>
+              <w:spacing w:after="0" w:before="0" w:line="210"/>
+            </w:pPr>
+            <w:r>
+              <w:rPr>
+                <w:rFonts w:ascii="Calibri" w:cs="Calibri" w:eastAsia="Calibri" w:hAnsi="Calibri"/>
+                <w:i/>
+                <w:iCs/>
+                <w:color w:val="9A9A9A"/>
+                <w:sz w:val="15"/>
+                <w:szCs w:val="15"/>
+              </w:rPr>
+              <w:t xml:space="preserve">À définir</w:t>
+            </w:r>
+          </w:p>
+        </w:tc>
+      </w:tr>
+      <w:tr>
+        <w:trPr>
+          <w:trHeight w:val="334" w:hRule="atLeast"/>
+        </w:trPr>
+        <w:tc>
+          <w:tcPr>
+            <w:tcW w:type="dxa" w:w="1530"/>
+            <w:shd w:fill="FAFAF6" w:color="auto" w:val="clear"/>
+            <w:tcMar>
+              <w:top w:type="dxa" w:w="45"/>
+              <w:left w:type="dxa" w:w="102"/>
+              <w:bottom w:type="dxa" w:w="45"/>
+              <w:right w:type="dxa" w:w="102"/>
+            </w:tcMar>
+            <w:vAlign w:val="center"/>
+          </w:tcPr>
+          <w:p>
+            <w:pPr>
+              <w:spacing w:after="0" w:before="0" w:line="210"/>
+              <w:jc w:val="center"/>
+            </w:pPr>
+            <w:r>
+              <w:rPr>
+                <w:rFonts w:ascii="Calibri" w:cs="Calibri" w:eastAsia="Calibri" w:hAnsi="Calibri"/>
+                <w:b/>
+                <w:bCs/>
+                <w:color w:val="C0392B"/>
+                <w:sz w:val="16"/>
+                <w:szCs w:val="16"/>
+              </w:rPr>
+              <w:t xml:space="preserve">Sem 26</w:t>
+            </w:r>
+            <w:r>
+              <w:rPr>
+                <w:rFonts w:ascii="Calibri" w:cs="Calibri" w:eastAsia="Calibri" w:hAnsi="Calibri"/>
+                <w:color w:val="6E6E6E"/>
+                <w:sz w:val="15"/>
+                <w:szCs w:val="15"/>
+              </w:rPr>
+              <w:t xml:space="preserve">   31/05</w:t>
+            </w:r>
+          </w:p>
+        </w:tc>
+        <w:tc>
+          <w:tcPr>
+            <w:tcW w:type="dxa" w:w="1927"/>
+            <w:shd w:fill="FAFAF6" w:color="auto" w:val="clear"/>
+            <w:tcMar>
+              <w:top w:type="dxa" w:w="45"/>
+              <w:left w:type="dxa" w:w="102"/>
+              <w:bottom w:type="dxa" w:w="45"/>
+              <w:right w:type="dxa" w:w="102"/>
+            </w:tcMar>
+            <w:vAlign w:val="center"/>
+          </w:tcPr>
+          <w:p>
+            <w:pPr>
+              <w:spacing w:after="0" w:before="0" w:line="210"/>
+            </w:pPr>
+            <w:r>
+              <w:rPr>
+                <w:rFonts w:ascii="Calibri" w:cs="Calibri" w:eastAsia="Calibri" w:hAnsi="Calibri"/>
+                <w:color w:val="2E2E2E"/>
+                <w:sz w:val="16"/>
+                <w:szCs w:val="16"/>
+              </w:rPr>
+              <w:t xml:space="preserve">Voir objectifs</w:t>
+            </w:r>
+          </w:p>
+        </w:tc>
+        <w:tc>
+          <w:tcPr>
+            <w:tcW w:type="dxa" w:w="1927"/>
+            <w:shd w:fill="FAFAF6" w:color="auto" w:val="clear"/>
+            <w:tcMar>
+              <w:top w:type="dxa" w:w="45"/>
+              <w:left w:type="dxa" w:w="102"/>
+              <w:bottom w:type="dxa" w:w="45"/>
+              <w:right w:type="dxa" w:w="102"/>
+            </w:tcMar>
+            <w:vAlign w:val="center"/>
+          </w:tcPr>
+          <w:p>
+            <w:pPr>
+              <w:spacing w:after="0" w:before="0" w:line="210"/>
+            </w:pPr>
+            <w:r>
+              <w:rPr>
+                <w:rFonts w:ascii="Calibri" w:cs="Calibri" w:eastAsia="Calibri" w:hAnsi="Calibri"/>
+                <w:color w:val="2E2E2E"/>
+                <w:sz w:val="16"/>
+                <w:szCs w:val="16"/>
+              </w:rPr>
+              <w:t xml:space="preserve">Voir objectifs</w:t>
+            </w:r>
+          </w:p>
+        </w:tc>
+        <w:tc>
+          <w:tcPr>
+            <w:tcW w:type="dxa" w:w="3174"/>
+            <w:shd w:fill="FAFAF6" w:color="auto" w:val="clear"/>
+            <w:tcMar>
+              <w:top w:type="dxa" w:w="45"/>
+              <w:left w:type="dxa" w:w="102"/>
+              <w:bottom w:type="dxa" w:w="45"/>
+              <w:right w:type="dxa" w:w="102"/>
+            </w:tcMar>
+            <w:vAlign w:val="center"/>
+          </w:tcPr>
+          <w:p>
+            <w:pPr>
+              <w:spacing w:after="0" w:before="0" w:line="210"/>
+            </w:pPr>
+            <w:r>
+              <w:rPr>
+                <w:rFonts w:ascii="Calibri" w:cs="Calibri" w:eastAsia="Calibri" w:hAnsi="Calibri"/>
+                <w:i/>
+                <w:iCs/>
+                <w:color w:val="9A9A9A"/>
+                <w:sz w:val="15"/>
+                <w:szCs w:val="15"/>
+              </w:rPr>
+              <w:t xml:space="preserve">À définir</w:t>
+            </w:r>
+          </w:p>
+        </w:tc>
+        <w:tc>
+          <w:tcPr>
+            <w:tcW w:type="dxa" w:w="3174"/>
+            <w:shd w:fill="FAFAF6" w:color="auto" w:val="clear"/>
+            <w:tcMar>
+              <w:top w:type="dxa" w:w="45"/>
+              <w:left w:type="dxa" w:w="102"/>
+              <w:bottom w:type="dxa" w:w="45"/>
+              <w:right w:type="dxa" w:w="102"/>
+            </w:tcMar>
+            <w:vAlign w:val="center"/>
+          </w:tcPr>
+          <w:p>
+            <w:pPr>
+              <w:spacing w:after="0" w:before="0" w:line="210"/>
+            </w:pPr>
+            <w:r>
+              <w:rPr>
+                <w:rFonts w:ascii="Calibri" w:cs="Calibri" w:eastAsia="Calibri" w:hAnsi="Calibri"/>
+                <w:i/>
+                <w:iCs/>
+                <w:color w:val="9A9A9A"/>
+                <w:sz w:val="15"/>
+                <w:szCs w:val="15"/>
+              </w:rPr>
+              <w:t xml:space="preserve">À définir</w:t>
+            </w:r>
+          </w:p>
+        </w:tc>
+        <w:tc>
+          <w:tcPr>
+            <w:tcW w:type="dxa" w:w="3401"/>
+            <w:shd w:fill="FAFAF6" w:color="auto" w:val="clear"/>
+            <w:tcMar>
+              <w:top w:type="dxa" w:w="45"/>
+              <w:left w:type="dxa" w:w="102"/>
+              <w:bottom w:type="dxa" w:w="45"/>
+              <w:right w:type="dxa" w:w="102"/>
+            </w:tcMar>
+            <w:vAlign w:val="center"/>
+          </w:tcPr>
+          <w:p>
+            <w:pPr>
+              <w:spacing w:after="0" w:before="0" w:line="210"/>
+            </w:pPr>
+            <w:r>
+              <w:rPr>
+                <w:rFonts w:ascii="Calibri" w:cs="Calibri" w:eastAsia="Calibri" w:hAnsi="Calibri"/>
+                <w:i/>
+                <w:iCs/>
+                <w:color w:val="9A9A9A"/>
+                <w:sz w:val="15"/>
+                <w:szCs w:val="15"/>
+              </w:rPr>
+              <w:t xml:space="preserve">À définir</w:t>
+            </w:r>
+          </w:p>
+        </w:tc>
+      </w:tr>
+      <w:tr>
+        <w:trPr>
+          <w:trHeight w:val="334" w:hRule="atLeast"/>
+        </w:trPr>
+        <w:tc>
+          <w:tcPr>
+            <w:tcW w:type="dxa" w:w="1530"/>
+            <w:shd w:fill="FFFFFF" w:color="auto" w:val="clear"/>
+            <w:tcMar>
+              <w:top w:type="dxa" w:w="45"/>
+              <w:left w:type="dxa" w:w="102"/>
+              <w:bottom w:type="dxa" w:w="45"/>
+              <w:right w:type="dxa" w:w="102"/>
+            </w:tcMar>
+            <w:vAlign w:val="center"/>
+          </w:tcPr>
+          <w:p>
+            <w:pPr>
+              <w:spacing w:after="0" w:before="0" w:line="210"/>
+              <w:jc w:val="center"/>
+            </w:pPr>
+            <w:r>
+              <w:rPr>
+                <w:rFonts w:ascii="Calibri" w:cs="Calibri" w:eastAsia="Calibri" w:hAnsi="Calibri"/>
+                <w:b/>
+                <w:bCs/>
+                <w:color w:val="C0392B"/>
+                <w:sz w:val="16"/>
+                <w:szCs w:val="16"/>
+              </w:rPr>
+              <w:t xml:space="preserve">Sem 27</w:t>
+            </w:r>
+            <w:r>
+              <w:rPr>
+                <w:rFonts w:ascii="Calibri" w:cs="Calibri" w:eastAsia="Calibri" w:hAnsi="Calibri"/>
+                <w:color w:val="6E6E6E"/>
+                <w:sz w:val="15"/>
+                <w:szCs w:val="15"/>
+              </w:rPr>
+              <w:t xml:space="preserve">   07/06</w:t>
+            </w:r>
+          </w:p>
+        </w:tc>
+        <w:tc>
+          <w:tcPr>
+            <w:tcW w:type="dxa" w:w="1927"/>
+            <w:shd w:fill="FFFFFF" w:color="auto" w:val="clear"/>
+            <w:tcMar>
+              <w:top w:type="dxa" w:w="45"/>
+              <w:left w:type="dxa" w:w="102"/>
+              <w:bottom w:type="dxa" w:w="45"/>
+              <w:right w:type="dxa" w:w="102"/>
+            </w:tcMar>
+            <w:vAlign w:val="center"/>
+          </w:tcPr>
+          <w:p>
+            <w:pPr>
+              <w:spacing w:after="0" w:before="0" w:line="210"/>
+            </w:pPr>
+            <w:r>
+              <w:rPr>
+                <w:rFonts w:ascii="Calibri" w:cs="Calibri" w:eastAsia="Calibri" w:hAnsi="Calibri"/>
+                <w:color w:val="2E2E2E"/>
+                <w:sz w:val="16"/>
+                <w:szCs w:val="16"/>
+              </w:rPr>
+              <w:t xml:space="preserve">Voir objectifs</w:t>
+            </w:r>
+          </w:p>
+        </w:tc>
+        <w:tc>
+          <w:tcPr>
+            <w:tcW w:type="dxa" w:w="1927"/>
+            <w:shd w:fill="FFFFFF" w:color="auto" w:val="clear"/>
+            <w:tcMar>
+              <w:top w:type="dxa" w:w="45"/>
+              <w:left w:type="dxa" w:w="102"/>
+              <w:bottom w:type="dxa" w:w="45"/>
+              <w:right w:type="dxa" w:w="102"/>
+            </w:tcMar>
+            <w:vAlign w:val="center"/>
+          </w:tcPr>
+          <w:p>
+            <w:pPr>
+              <w:spacing w:after="0" w:before="0" w:line="210"/>
+            </w:pPr>
+            <w:r>
+              <w:rPr>
+                <w:rFonts w:ascii="Calibri" w:cs="Calibri" w:eastAsia="Calibri" w:hAnsi="Calibri"/>
+                <w:color w:val="2E2E2E"/>
+                <w:sz w:val="16"/>
+                <w:szCs w:val="16"/>
+              </w:rPr>
+              <w:t xml:space="preserve">Voir objectifs</w:t>
+            </w:r>
+          </w:p>
+        </w:tc>
+        <w:tc>
+          <w:tcPr>
+            <w:tcW w:type="dxa" w:w="3174"/>
+            <w:shd w:fill="FFFFFF" w:color="auto" w:val="clear"/>
+            <w:tcMar>
+              <w:top w:type="dxa" w:w="45"/>
+              <w:left w:type="dxa" w:w="102"/>
+              <w:bottom w:type="dxa" w:w="45"/>
+              <w:right w:type="dxa" w:w="102"/>
+            </w:tcMar>
+            <w:vAlign w:val="center"/>
+          </w:tcPr>
+          <w:p>
+            <w:pPr>
+              <w:spacing w:after="0" w:before="0" w:line="210"/>
+            </w:pPr>
+            <w:r>
+              <w:rPr>
+                <w:rFonts w:ascii="Calibri" w:cs="Calibri" w:eastAsia="Calibri" w:hAnsi="Calibri"/>
+                <w:i/>
+                <w:iCs/>
+                <w:color w:val="9A9A9A"/>
+                <w:sz w:val="15"/>
+                <w:szCs w:val="15"/>
+              </w:rPr>
+              <w:t xml:space="preserve">À définir</w:t>
+            </w:r>
+          </w:p>
+        </w:tc>
+        <w:tc>
+          <w:tcPr>
+            <w:tcW w:type="dxa" w:w="3174"/>
+            <w:shd w:fill="FFFFFF" w:color="auto" w:val="clear"/>
+            <w:tcMar>
+              <w:top w:type="dxa" w:w="45"/>
+              <w:left w:type="dxa" w:w="102"/>
+              <w:bottom w:type="dxa" w:w="45"/>
+              <w:right w:type="dxa" w:w="102"/>
+            </w:tcMar>
+            <w:vAlign w:val="center"/>
+          </w:tcPr>
+          <w:p>
+            <w:pPr>
+              <w:spacing w:after="0" w:before="0" w:line="210"/>
+            </w:pPr>
+            <w:r>
+              <w:rPr>
+                <w:rFonts w:ascii="Calibri" w:cs="Calibri" w:eastAsia="Calibri" w:hAnsi="Calibri"/>
+                <w:i/>
+                <w:iCs/>
+                <w:color w:val="9A9A9A"/>
+                <w:sz w:val="15"/>
+                <w:szCs w:val="15"/>
+              </w:rPr>
+              <w:t xml:space="preserve">À définir</w:t>
+            </w:r>
+          </w:p>
+        </w:tc>
+        <w:tc>
+          <w:tcPr>
+            <w:tcW w:type="dxa" w:w="3401"/>
+            <w:shd w:fill="FFFFFF" w:color="auto" w:val="clear"/>
+            <w:tcMar>
+              <w:top w:type="dxa" w:w="45"/>
+              <w:left w:type="dxa" w:w="102"/>
+              <w:bottom w:type="dxa" w:w="45"/>
+              <w:right w:type="dxa" w:w="102"/>
+            </w:tcMar>
+            <w:vAlign w:val="center"/>
+          </w:tcPr>
+          <w:p>
+            <w:pPr>
+              <w:spacing w:after="0" w:before="0" w:line="210"/>
+            </w:pPr>
+            <w:r>
+              <w:rPr>
+                <w:rFonts w:ascii="Calibri" w:cs="Calibri" w:eastAsia="Calibri" w:hAnsi="Calibri"/>
+                <w:i/>
+                <w:iCs/>
+                <w:color w:val="9A9A9A"/>
+                <w:sz w:val="15"/>
+                <w:szCs w:val="15"/>
+              </w:rPr>
+              <w:t xml:space="preserve">À définir</w:t>
+            </w:r>
+          </w:p>
+        </w:tc>
+      </w:tr>
+      <w:tr>
+        <w:trPr>
+          <w:trHeight w:val="334" w:hRule="atLeast"/>
+        </w:trPr>
+        <w:tc>
+          <w:tcPr>
+            <w:tcW w:type="dxa" w:w="1530"/>
+            <w:shd w:fill="FAFAF6" w:color="auto" w:val="clear"/>
+            <w:tcMar>
+              <w:top w:type="dxa" w:w="45"/>
+              <w:left w:type="dxa" w:w="102"/>
+              <w:bottom w:type="dxa" w:w="45"/>
+              <w:right w:type="dxa" w:w="102"/>
+            </w:tcMar>
+            <w:vAlign w:val="center"/>
+          </w:tcPr>
+          <w:p>
+            <w:pPr>
+              <w:spacing w:after="0" w:before="0" w:line="210"/>
+              <w:jc w:val="center"/>
+            </w:pPr>
+            <w:r>
+              <w:rPr>
+                <w:rFonts w:ascii="Calibri" w:cs="Calibri" w:eastAsia="Calibri" w:hAnsi="Calibri"/>
+                <w:b/>
+                <w:bCs/>
+                <w:color w:val="C0392B"/>
+                <w:sz w:val="16"/>
+                <w:szCs w:val="16"/>
+              </w:rPr>
+              <w:t xml:space="preserve">Sem 28</w:t>
+            </w:r>
+            <w:r>
+              <w:rPr>
+                <w:rFonts w:ascii="Calibri" w:cs="Calibri" w:eastAsia="Calibri" w:hAnsi="Calibri"/>
+                <w:color w:val="6E6E6E"/>
+                <w:sz w:val="15"/>
+                <w:szCs w:val="15"/>
+              </w:rPr>
+              <w:t xml:space="preserve">   14/06</w:t>
+            </w:r>
+          </w:p>
+        </w:tc>
+        <w:tc>
+          <w:tcPr>
+            <w:tcW w:type="dxa" w:w="1927"/>
+            <w:shd w:fill="FAFAF6" w:color="auto" w:val="clear"/>
+            <w:tcMar>
+              <w:top w:type="dxa" w:w="45"/>
+              <w:left w:type="dxa" w:w="102"/>
+              <w:bottom w:type="dxa" w:w="45"/>
+              <w:right w:type="dxa" w:w="102"/>
+            </w:tcMar>
+            <w:vAlign w:val="center"/>
+          </w:tcPr>
+          <w:p>
+            <w:pPr>
+              <w:spacing w:after="0" w:before="0" w:line="210"/>
+            </w:pPr>
+            <w:r>
+              <w:rPr>
+                <w:rFonts w:ascii="Calibri" w:cs="Calibri" w:eastAsia="Calibri" w:hAnsi="Calibri"/>
+                <w:color w:val="2E2E2E"/>
+                <w:sz w:val="16"/>
+                <w:szCs w:val="16"/>
+              </w:rPr>
+              <w:t xml:space="preserve">Voir objectifs</w:t>
+            </w:r>
+          </w:p>
+        </w:tc>
+        <w:tc>
+          <w:tcPr>
+            <w:tcW w:type="dxa" w:w="1927"/>
+            <w:shd w:fill="FAFAF6" w:color="auto" w:val="clear"/>
+            <w:tcMar>
+              <w:top w:type="dxa" w:w="45"/>
+              <w:left w:type="dxa" w:w="102"/>
+              <w:bottom w:type="dxa" w:w="45"/>
+              <w:right w:type="dxa" w:w="102"/>
+            </w:tcMar>
+            <w:vAlign w:val="center"/>
+          </w:tcPr>
+          <w:p>
+            <w:pPr>
+              <w:spacing w:after="0" w:before="0" w:line="210"/>
+            </w:pPr>
+            <w:r>
+              <w:rPr>
+                <w:rFonts w:ascii="Calibri" w:cs="Calibri" w:eastAsia="Calibri" w:hAnsi="Calibri"/>
+                <w:color w:val="2E2E2E"/>
+                <w:sz w:val="16"/>
+                <w:szCs w:val="16"/>
+              </w:rPr>
+              <w:t xml:space="preserve">Voir objectifs</w:t>
+            </w:r>
+          </w:p>
+        </w:tc>
+        <w:tc>
+          <w:tcPr>
+            <w:tcW w:type="dxa" w:w="3174"/>
+            <w:shd w:fill="FAFAF6" w:color="auto" w:val="clear"/>
+            <w:tcMar>
+              <w:top w:type="dxa" w:w="45"/>
+              <w:left w:type="dxa" w:w="102"/>
+              <w:bottom w:type="dxa" w:w="45"/>
+              <w:right w:type="dxa" w:w="102"/>
+            </w:tcMar>
+            <w:vAlign w:val="center"/>
+          </w:tcPr>
+          <w:p>
+            <w:pPr>
+              <w:spacing w:after="0" w:before="0" w:line="210"/>
+            </w:pPr>
+            <w:r>
+              <w:rPr>
+                <w:rFonts w:ascii="Calibri" w:cs="Calibri" w:eastAsia="Calibri" w:hAnsi="Calibri"/>
+                <w:i/>
+                <w:iCs/>
+                <w:color w:val="9A9A9A"/>
+                <w:sz w:val="15"/>
+                <w:szCs w:val="15"/>
+              </w:rPr>
+              <w:t xml:space="preserve">À définir</w:t>
+            </w:r>
+          </w:p>
+        </w:tc>
+        <w:tc>
+          <w:tcPr>
+            <w:tcW w:type="dxa" w:w="3174"/>
+            <w:shd w:fill="FAFAF6" w:color="auto" w:val="clear"/>
+            <w:tcMar>
+              <w:top w:type="dxa" w:w="45"/>
+              <w:left w:type="dxa" w:w="102"/>
+              <w:bottom w:type="dxa" w:w="45"/>
+              <w:right w:type="dxa" w:w="102"/>
+            </w:tcMar>
+            <w:vAlign w:val="center"/>
+          </w:tcPr>
+          <w:p>
+            <w:pPr>
+              <w:spacing w:after="0" w:before="0" w:line="210"/>
+            </w:pPr>
+            <w:r>
+              <w:rPr>
+                <w:rFonts w:ascii="Calibri" w:cs="Calibri" w:eastAsia="Calibri" w:hAnsi="Calibri"/>
+                <w:i/>
+                <w:iCs/>
+                <w:color w:val="9A9A9A"/>
+                <w:sz w:val="15"/>
+                <w:szCs w:val="15"/>
+              </w:rPr>
+              <w:t xml:space="preserve">À définir</w:t>
+            </w:r>
+          </w:p>
+        </w:tc>
+        <w:tc>
+          <w:tcPr>
+            <w:tcW w:type="dxa" w:w="3401"/>
+            <w:shd w:fill="FAFAF6" w:color="auto" w:val="clear"/>
+            <w:tcMar>
+              <w:top w:type="dxa" w:w="45"/>
+              <w:left w:type="dxa" w:w="102"/>
+              <w:bottom w:type="dxa" w:w="45"/>
+              <w:right w:type="dxa" w:w="102"/>
+            </w:tcMar>
+            <w:vAlign w:val="center"/>
+          </w:tcPr>
+          <w:p>
+            <w:pPr>
+              <w:spacing w:after="0" w:before="0" w:line="210"/>
+            </w:pPr>
+            <w:r>
+              <w:rPr>
+                <w:rFonts w:ascii="Calibri" w:cs="Calibri" w:eastAsia="Calibri" w:hAnsi="Calibri"/>
+                <w:i/>
+                <w:iCs/>
+                <w:color w:val="9A9A9A"/>
+                <w:sz w:val="15"/>
+                <w:szCs w:val="15"/>
+              </w:rPr>
+              <w:t xml:space="preserve">À définir</w:t>
             </w:r>
           </w:p>
         </w:tc>
       </w:tr>
     </w:tbl>
+    <w:p>
+      <w:pPr>
+        <w:spacing w:after="0" w:before="70" w:line="240"/>
+      </w:pPr>
+      <w:r>
+        <w:rPr>
+          <w:rFonts w:ascii="Calibri" w:cs="Calibri" w:eastAsia="Calibri" w:hAnsi="Calibri"/>
+          <w:i/>
+          <w:iCs/>
+          <w:color w:val="6E6E6E"/>
+          <w:sz w:val="15"/>
+          <w:szCs w:val="15"/>
+        </w:rPr>
+        <w:t xml:space="preserve">Reprise le lendemain de chaque fin d’interruption. Seule exception : la Toussaint s’achève un vendredi — les cours reprennent le samedi 31 octobre.</w:t>
+      </w:r>
+    </w:p>
     <w:p>
       <w:r>
         <w:br w:type="page"/>
@@ -4000,7 +5658,7 @@
           <w:sz w:val="20"/>
           <w:szCs w:val="20"/>
         </w:rPr>
-        <w:t xml:space="preserve">Saison hiver 2026-2027</w:t>
+        <w:t xml:space="preserve">Saison 2026-2027</w:t>
       </w:r>
     </w:p>
     <w:p>
@@ -4186,7 +5844,7 @@
         <w:sz w:val="15"/>
         <w:szCs w:val="15"/>
       </w:rPr>
-      <w:t xml:space="preserve">Lambermont Royal Tennis Club &amp; School  ·  Thèmes des cours  ·  Saison hiver 2026-2027</w:t>
+      <w:t xml:space="preserve">Lambermont Royal Tennis Club &amp; School  ·  Thèmes des cours  ·  Saison 2026-2027</w:t>
     </w:r>
   </w:p>
 </w:ftr>

</xml_diff>

<commit_message>
Rétablit le titre hiver et arrête la grille fin mars
Le document couvre la saison hiver, du 28 septembre au 27 mars, soit
vingt semaines et trois interruptions. Le programme du printemps fera
l'objet d'un document distinct.

Co-Authored-By: Claude Opus 5 <noreply@anthropic.com>
Claude-Session: https://claude.ai/code/session_01RsDkbcD3KwyPviDTcs72WZ
</commit_message>
<xml_diff>
--- a/Themes_des_cours_2026-2027.docx
+++ b/Themes_des_cours_2026-2027.docx
@@ -118,7 +118,7 @@
                 <w:sz w:val="20"/>
                 <w:szCs w:val="20"/>
               </w:rPr>
-              <w:t xml:space="preserve">Saison 2026-2027</w:t>
+              <w:t xml:space="preserve">Saison hiver 2026-2027</w:t>
             </w:r>
           </w:p>
           <w:p>
@@ -135,7 +135,7 @@
                 <w:sz w:val="18"/>
                 <w:szCs w:val="18"/>
               </w:rPr>
-              <w:t xml:space="preserve">Du lundi 28 septembre 2026 au samedi 19 juin 2027  ·  28 semaines</w:t>
+              <w:t xml:space="preserve">Du lundi 28 septembre 2026 au samedi 27 mars 2027  ·  20 semaines</w:t>
             </w:r>
           </w:p>
         </w:tc>
@@ -366,7 +366,7 @@
       </w:tr>
       <w:tr>
         <w:trPr>
-          <w:trHeight w:val="334" w:hRule="atLeast"/>
+          <w:trHeight w:val="311" w:hRule="atLeast"/>
         </w:trPr>
         <w:tc>
           <w:tcPr>
@@ -545,7 +545,7 @@
       </w:tr>
       <w:tr>
         <w:trPr>
-          <w:trHeight w:val="334" w:hRule="atLeast"/>
+          <w:trHeight w:val="311" w:hRule="atLeast"/>
         </w:trPr>
         <w:tc>
           <w:tcPr>
@@ -724,7 +724,7 @@
       </w:tr>
       <w:tr>
         <w:trPr>
-          <w:trHeight w:val="334" w:hRule="atLeast"/>
+          <w:trHeight w:val="311" w:hRule="atLeast"/>
         </w:trPr>
         <w:tc>
           <w:tcPr>
@@ -903,7 +903,7 @@
       </w:tr>
       <w:tr>
         <w:trPr>
-          <w:trHeight w:val="289" w:hRule="atLeast"/>
+          <w:trHeight w:val="272" w:hRule="atLeast"/>
         </w:trPr>
         <w:tc>
           <w:tcPr>
@@ -939,7 +939,7 @@
       </w:tr>
       <w:tr>
         <w:trPr>
-          <w:trHeight w:val="334" w:hRule="atLeast"/>
+          <w:trHeight w:val="311" w:hRule="atLeast"/>
         </w:trPr>
         <w:tc>
           <w:tcPr>
@@ -1118,7 +1118,7 @@
       </w:tr>
       <w:tr>
         <w:trPr>
-          <w:trHeight w:val="334" w:hRule="atLeast"/>
+          <w:trHeight w:val="311" w:hRule="atLeast"/>
         </w:trPr>
         <w:tc>
           <w:tcPr>
@@ -1297,7 +1297,7 @@
       </w:tr>
       <w:tr>
         <w:trPr>
-          <w:trHeight w:val="334" w:hRule="atLeast"/>
+          <w:trHeight w:val="311" w:hRule="atLeast"/>
         </w:trPr>
         <w:tc>
           <w:tcPr>
@@ -1476,7 +1476,7 @@
       </w:tr>
       <w:tr>
         <w:trPr>
-          <w:trHeight w:val="334" w:hRule="atLeast"/>
+          <w:trHeight w:val="311" w:hRule="atLeast"/>
         </w:trPr>
         <w:tc>
           <w:tcPr>
@@ -1655,7 +1655,7 @@
       </w:tr>
       <w:tr>
         <w:trPr>
-          <w:trHeight w:val="334" w:hRule="atLeast"/>
+          <w:trHeight w:val="311" w:hRule="atLeast"/>
         </w:trPr>
         <w:tc>
           <w:tcPr>
@@ -1834,7 +1834,7 @@
       </w:tr>
       <w:tr>
         <w:trPr>
-          <w:trHeight w:val="334" w:hRule="atLeast"/>
+          <w:trHeight w:val="311" w:hRule="atLeast"/>
         </w:trPr>
         <w:tc>
           <w:tcPr>
@@ -2013,7 +2013,7 @@
       </w:tr>
       <w:tr>
         <w:trPr>
-          <w:trHeight w:val="334" w:hRule="atLeast"/>
+          <w:trHeight w:val="311" w:hRule="atLeast"/>
         </w:trPr>
         <w:tc>
           <w:tcPr>
@@ -2192,7 +2192,7 @@
       </w:tr>
       <w:tr>
         <w:trPr>
-          <w:trHeight w:val="289" w:hRule="atLeast"/>
+          <w:trHeight w:val="272" w:hRule="atLeast"/>
         </w:trPr>
         <w:tc>
           <w:tcPr>
@@ -2228,7 +2228,7 @@
       </w:tr>
       <w:tr>
         <w:trPr>
-          <w:trHeight w:val="334" w:hRule="atLeast"/>
+          <w:trHeight w:val="311" w:hRule="atLeast"/>
         </w:trPr>
         <w:tc>
           <w:tcPr>
@@ -2407,7 +2407,7 @@
       </w:tr>
       <w:tr>
         <w:trPr>
-          <w:trHeight w:val="334" w:hRule="atLeast"/>
+          <w:trHeight w:val="311" w:hRule="atLeast"/>
         </w:trPr>
         <w:tc>
           <w:tcPr>
@@ -2586,7 +2586,7 @@
       </w:tr>
       <w:tr>
         <w:trPr>
-          <w:trHeight w:val="334" w:hRule="atLeast"/>
+          <w:trHeight w:val="311" w:hRule="atLeast"/>
         </w:trPr>
         <w:tc>
           <w:tcPr>
@@ -2765,7 +2765,7 @@
       </w:tr>
       <w:tr>
         <w:trPr>
-          <w:trHeight w:val="334" w:hRule="atLeast"/>
+          <w:trHeight w:val="311" w:hRule="atLeast"/>
         </w:trPr>
         <w:tc>
           <w:tcPr>
@@ -2944,7 +2944,7 @@
       </w:tr>
       <w:tr>
         <w:trPr>
-          <w:trHeight w:val="334" w:hRule="atLeast"/>
+          <w:trHeight w:val="311" w:hRule="atLeast"/>
         </w:trPr>
         <w:tc>
           <w:tcPr>
@@ -3123,7 +3123,7 @@
       </w:tr>
       <w:tr>
         <w:trPr>
-          <w:trHeight w:val="334" w:hRule="atLeast"/>
+          <w:trHeight w:val="311" w:hRule="atLeast"/>
         </w:trPr>
         <w:tc>
           <w:tcPr>
@@ -3302,7 +3302,7 @@
       </w:tr>
       <w:tr>
         <w:trPr>
-          <w:trHeight w:val="334" w:hRule="atLeast"/>
+          <w:trHeight w:val="311" w:hRule="atLeast"/>
         </w:trPr>
         <w:tc>
           <w:tcPr>
@@ -3481,7 +3481,7 @@
       </w:tr>
       <w:tr>
         <w:trPr>
-          <w:trHeight w:val="289" w:hRule="atLeast"/>
+          <w:trHeight w:val="272" w:hRule="atLeast"/>
         </w:trPr>
         <w:tc>
           <w:tcPr>
@@ -3517,7 +3517,7 @@
       </w:tr>
       <w:tr>
         <w:trPr>
-          <w:trHeight w:val="334" w:hRule="atLeast"/>
+          <w:trHeight w:val="311" w:hRule="atLeast"/>
         </w:trPr>
         <w:tc>
           <w:tcPr>
@@ -3696,7 +3696,7 @@
       </w:tr>
       <w:tr>
         <w:trPr>
-          <w:trHeight w:val="334" w:hRule="atLeast"/>
+          <w:trHeight w:val="311" w:hRule="atLeast"/>
         </w:trPr>
         <w:tc>
           <w:tcPr>
@@ -3875,7 +3875,7 @@
       </w:tr>
       <w:tr>
         <w:trPr>
-          <w:trHeight w:val="334" w:hRule="atLeast"/>
+          <w:trHeight w:val="311" w:hRule="atLeast"/>
         </w:trPr>
         <w:tc>
           <w:tcPr>
@@ -4048,1558 +4048,6 @@
                 <w:szCs w:val="16"/>
               </w:rPr>
               <w:t xml:space="preserve">Points – Matchs</w:t>
-            </w:r>
-          </w:p>
-        </w:tc>
-      </w:tr>
-      <w:tr>
-        <w:trPr>
-          <w:trHeight w:val="289" w:hRule="atLeast"/>
-        </w:trPr>
-        <w:tc>
-          <w:tcPr>
-            <w:tcW w:type="dxa" w:w="15133"/>
-            <w:gridSpan w:val="6"/>
-            <w:shd w:fill="F4F6EA" w:color="auto" w:val="clear"/>
-            <w:tcMar>
-              <w:top w:type="dxa" w:w="56"/>
-              <w:left w:type="dxa" w:w="113"/>
-              <w:bottom w:type="dxa" w:w="56"/>
-              <w:right w:type="dxa" w:w="113"/>
-            </w:tcMar>
-            <w:vAlign w:val="center"/>
-          </w:tcPr>
-          <w:p>
-            <w:pPr>
-              <w:spacing w:after="0" w:before="0" w:line="240"/>
-              <w:jc w:val="center"/>
-            </w:pPr>
-            <w:r>
-              <w:rPr>
-                <w:rFonts w:ascii="Calibri" w:cs="Calibri" w:eastAsia="Calibri" w:hAnsi="Calibri"/>
-                <w:b/>
-                <w:bCs/>
-                <w:color w:val="8A9E28"/>
-                <w:sz w:val="18"/>
-                <w:szCs w:val="18"/>
-              </w:rPr>
-              <w:t xml:space="preserve">PRINTEMPS — du 28/03 au 11/04, pas de cours</w:t>
-            </w:r>
-          </w:p>
-        </w:tc>
-      </w:tr>
-      <w:tr>
-        <w:trPr>
-          <w:trHeight w:val="334" w:hRule="atLeast"/>
-        </w:trPr>
-        <w:tc>
-          <w:tcPr>
-            <w:tcW w:type="dxa" w:w="1530"/>
-            <w:shd w:fill="FFFFFF" w:color="auto" w:val="clear"/>
-            <w:tcMar>
-              <w:top w:type="dxa" w:w="45"/>
-              <w:left w:type="dxa" w:w="102"/>
-              <w:bottom w:type="dxa" w:w="45"/>
-              <w:right w:type="dxa" w:w="102"/>
-            </w:tcMar>
-            <w:vAlign w:val="center"/>
-          </w:tcPr>
-          <w:p>
-            <w:pPr>
-              <w:spacing w:after="0" w:before="0" w:line="210"/>
-              <w:jc w:val="center"/>
-            </w:pPr>
-            <w:r>
-              <w:rPr>
-                <w:rFonts w:ascii="Calibri" w:cs="Calibri" w:eastAsia="Calibri" w:hAnsi="Calibri"/>
-                <w:b/>
-                <w:bCs/>
-                <w:color w:val="C0392B"/>
-                <w:sz w:val="16"/>
-                <w:szCs w:val="16"/>
-              </w:rPr>
-              <w:t xml:space="preserve">Sem 21</w:t>
-            </w:r>
-            <w:r>
-              <w:rPr>
-                <w:rFonts w:ascii="Calibri" w:cs="Calibri" w:eastAsia="Calibri" w:hAnsi="Calibri"/>
-                <w:color w:val="6E6E6E"/>
-                <w:sz w:val="15"/>
-                <w:szCs w:val="15"/>
-              </w:rPr>
-              <w:t xml:space="preserve">   12/04</w:t>
-            </w:r>
-          </w:p>
-        </w:tc>
-        <w:tc>
-          <w:tcPr>
-            <w:tcW w:type="dxa" w:w="1927"/>
-            <w:shd w:fill="FFFFFF" w:color="auto" w:val="clear"/>
-            <w:tcMar>
-              <w:top w:type="dxa" w:w="45"/>
-              <w:left w:type="dxa" w:w="102"/>
-              <w:bottom w:type="dxa" w:w="45"/>
-              <w:right w:type="dxa" w:w="102"/>
-            </w:tcMar>
-            <w:vAlign w:val="center"/>
-          </w:tcPr>
-          <w:p>
-            <w:pPr>
-              <w:spacing w:after="0" w:before="0" w:line="210"/>
-            </w:pPr>
-            <w:r>
-              <w:rPr>
-                <w:rFonts w:ascii="Calibri" w:cs="Calibri" w:eastAsia="Calibri" w:hAnsi="Calibri"/>
-                <w:color w:val="2E2E2E"/>
-                <w:sz w:val="16"/>
-                <w:szCs w:val="16"/>
-              </w:rPr>
-              <w:t xml:space="preserve">Voir objectifs</w:t>
-            </w:r>
-          </w:p>
-        </w:tc>
-        <w:tc>
-          <w:tcPr>
-            <w:tcW w:type="dxa" w:w="1927"/>
-            <w:shd w:fill="FFFFFF" w:color="auto" w:val="clear"/>
-            <w:tcMar>
-              <w:top w:type="dxa" w:w="45"/>
-              <w:left w:type="dxa" w:w="102"/>
-              <w:bottom w:type="dxa" w:w="45"/>
-              <w:right w:type="dxa" w:w="102"/>
-            </w:tcMar>
-            <w:vAlign w:val="center"/>
-          </w:tcPr>
-          <w:p>
-            <w:pPr>
-              <w:spacing w:after="0" w:before="0" w:line="210"/>
-            </w:pPr>
-            <w:r>
-              <w:rPr>
-                <w:rFonts w:ascii="Calibri" w:cs="Calibri" w:eastAsia="Calibri" w:hAnsi="Calibri"/>
-                <w:color w:val="2E2E2E"/>
-                <w:sz w:val="16"/>
-                <w:szCs w:val="16"/>
-              </w:rPr>
-              <w:t xml:space="preserve">Voir objectifs</w:t>
-            </w:r>
-          </w:p>
-        </w:tc>
-        <w:tc>
-          <w:tcPr>
-            <w:tcW w:type="dxa" w:w="3174"/>
-            <w:shd w:fill="FFFFFF" w:color="auto" w:val="clear"/>
-            <w:tcMar>
-              <w:top w:type="dxa" w:w="45"/>
-              <w:left w:type="dxa" w:w="102"/>
-              <w:bottom w:type="dxa" w:w="45"/>
-              <w:right w:type="dxa" w:w="102"/>
-            </w:tcMar>
-            <w:vAlign w:val="center"/>
-          </w:tcPr>
-          <w:p>
-            <w:pPr>
-              <w:spacing w:after="0" w:before="0" w:line="210"/>
-            </w:pPr>
-            <w:r>
-              <w:rPr>
-                <w:rFonts w:ascii="Calibri" w:cs="Calibri" w:eastAsia="Calibri" w:hAnsi="Calibri"/>
-                <w:i/>
-                <w:iCs/>
-                <w:color w:val="9A9A9A"/>
-                <w:sz w:val="15"/>
-                <w:szCs w:val="15"/>
-              </w:rPr>
-              <w:t xml:space="preserve">À définir</w:t>
-            </w:r>
-          </w:p>
-        </w:tc>
-        <w:tc>
-          <w:tcPr>
-            <w:tcW w:type="dxa" w:w="3174"/>
-            <w:shd w:fill="FFFFFF" w:color="auto" w:val="clear"/>
-            <w:tcMar>
-              <w:top w:type="dxa" w:w="45"/>
-              <w:left w:type="dxa" w:w="102"/>
-              <w:bottom w:type="dxa" w:w="45"/>
-              <w:right w:type="dxa" w:w="102"/>
-            </w:tcMar>
-            <w:vAlign w:val="center"/>
-          </w:tcPr>
-          <w:p>
-            <w:pPr>
-              <w:spacing w:after="0" w:before="0" w:line="210"/>
-            </w:pPr>
-            <w:r>
-              <w:rPr>
-                <w:rFonts w:ascii="Calibri" w:cs="Calibri" w:eastAsia="Calibri" w:hAnsi="Calibri"/>
-                <w:i/>
-                <w:iCs/>
-                <w:color w:val="9A9A9A"/>
-                <w:sz w:val="15"/>
-                <w:szCs w:val="15"/>
-              </w:rPr>
-              <w:t xml:space="preserve">À définir</w:t>
-            </w:r>
-          </w:p>
-        </w:tc>
-        <w:tc>
-          <w:tcPr>
-            <w:tcW w:type="dxa" w:w="3401"/>
-            <w:shd w:fill="FFFFFF" w:color="auto" w:val="clear"/>
-            <w:tcMar>
-              <w:top w:type="dxa" w:w="45"/>
-              <w:left w:type="dxa" w:w="102"/>
-              <w:bottom w:type="dxa" w:w="45"/>
-              <w:right w:type="dxa" w:w="102"/>
-            </w:tcMar>
-            <w:vAlign w:val="center"/>
-          </w:tcPr>
-          <w:p>
-            <w:pPr>
-              <w:spacing w:after="0" w:before="0" w:line="210"/>
-            </w:pPr>
-            <w:r>
-              <w:rPr>
-                <w:rFonts w:ascii="Calibri" w:cs="Calibri" w:eastAsia="Calibri" w:hAnsi="Calibri"/>
-                <w:i/>
-                <w:iCs/>
-                <w:color w:val="9A9A9A"/>
-                <w:sz w:val="15"/>
-                <w:szCs w:val="15"/>
-              </w:rPr>
-              <w:t xml:space="preserve">À définir</w:t>
-            </w:r>
-          </w:p>
-        </w:tc>
-      </w:tr>
-      <w:tr>
-        <w:trPr>
-          <w:trHeight w:val="334" w:hRule="atLeast"/>
-        </w:trPr>
-        <w:tc>
-          <w:tcPr>
-            <w:tcW w:type="dxa" w:w="1530"/>
-            <w:shd w:fill="FAFAF6" w:color="auto" w:val="clear"/>
-            <w:tcMar>
-              <w:top w:type="dxa" w:w="45"/>
-              <w:left w:type="dxa" w:w="102"/>
-              <w:bottom w:type="dxa" w:w="45"/>
-              <w:right w:type="dxa" w:w="102"/>
-            </w:tcMar>
-            <w:vAlign w:val="center"/>
-          </w:tcPr>
-          <w:p>
-            <w:pPr>
-              <w:spacing w:after="0" w:before="0" w:line="210"/>
-              <w:jc w:val="center"/>
-            </w:pPr>
-            <w:r>
-              <w:rPr>
-                <w:rFonts w:ascii="Calibri" w:cs="Calibri" w:eastAsia="Calibri" w:hAnsi="Calibri"/>
-                <w:b/>
-                <w:bCs/>
-                <w:color w:val="C0392B"/>
-                <w:sz w:val="16"/>
-                <w:szCs w:val="16"/>
-              </w:rPr>
-              <w:t xml:space="preserve">Sem 22</w:t>
-            </w:r>
-            <w:r>
-              <w:rPr>
-                <w:rFonts w:ascii="Calibri" w:cs="Calibri" w:eastAsia="Calibri" w:hAnsi="Calibri"/>
-                <w:color w:val="6E6E6E"/>
-                <w:sz w:val="15"/>
-                <w:szCs w:val="15"/>
-              </w:rPr>
-              <w:t xml:space="preserve">   19/04</w:t>
-            </w:r>
-          </w:p>
-        </w:tc>
-        <w:tc>
-          <w:tcPr>
-            <w:tcW w:type="dxa" w:w="1927"/>
-            <w:shd w:fill="FAFAF6" w:color="auto" w:val="clear"/>
-            <w:tcMar>
-              <w:top w:type="dxa" w:w="45"/>
-              <w:left w:type="dxa" w:w="102"/>
-              <w:bottom w:type="dxa" w:w="45"/>
-              <w:right w:type="dxa" w:w="102"/>
-            </w:tcMar>
-            <w:vAlign w:val="center"/>
-          </w:tcPr>
-          <w:p>
-            <w:pPr>
-              <w:spacing w:after="0" w:before="0" w:line="210"/>
-            </w:pPr>
-            <w:r>
-              <w:rPr>
-                <w:rFonts w:ascii="Calibri" w:cs="Calibri" w:eastAsia="Calibri" w:hAnsi="Calibri"/>
-                <w:color w:val="2E2E2E"/>
-                <w:sz w:val="16"/>
-                <w:szCs w:val="16"/>
-              </w:rPr>
-              <w:t xml:space="preserve">Voir objectifs</w:t>
-            </w:r>
-          </w:p>
-        </w:tc>
-        <w:tc>
-          <w:tcPr>
-            <w:tcW w:type="dxa" w:w="1927"/>
-            <w:shd w:fill="FAFAF6" w:color="auto" w:val="clear"/>
-            <w:tcMar>
-              <w:top w:type="dxa" w:w="45"/>
-              <w:left w:type="dxa" w:w="102"/>
-              <w:bottom w:type="dxa" w:w="45"/>
-              <w:right w:type="dxa" w:w="102"/>
-            </w:tcMar>
-            <w:vAlign w:val="center"/>
-          </w:tcPr>
-          <w:p>
-            <w:pPr>
-              <w:spacing w:after="0" w:before="0" w:line="210"/>
-            </w:pPr>
-            <w:r>
-              <w:rPr>
-                <w:rFonts w:ascii="Calibri" w:cs="Calibri" w:eastAsia="Calibri" w:hAnsi="Calibri"/>
-                <w:color w:val="2E2E2E"/>
-                <w:sz w:val="16"/>
-                <w:szCs w:val="16"/>
-              </w:rPr>
-              <w:t xml:space="preserve">Voir objectifs</w:t>
-            </w:r>
-          </w:p>
-        </w:tc>
-        <w:tc>
-          <w:tcPr>
-            <w:tcW w:type="dxa" w:w="3174"/>
-            <w:shd w:fill="FAFAF6" w:color="auto" w:val="clear"/>
-            <w:tcMar>
-              <w:top w:type="dxa" w:w="45"/>
-              <w:left w:type="dxa" w:w="102"/>
-              <w:bottom w:type="dxa" w:w="45"/>
-              <w:right w:type="dxa" w:w="102"/>
-            </w:tcMar>
-            <w:vAlign w:val="center"/>
-          </w:tcPr>
-          <w:p>
-            <w:pPr>
-              <w:spacing w:after="0" w:before="0" w:line="210"/>
-            </w:pPr>
-            <w:r>
-              <w:rPr>
-                <w:rFonts w:ascii="Calibri" w:cs="Calibri" w:eastAsia="Calibri" w:hAnsi="Calibri"/>
-                <w:i/>
-                <w:iCs/>
-                <w:color w:val="9A9A9A"/>
-                <w:sz w:val="15"/>
-                <w:szCs w:val="15"/>
-              </w:rPr>
-              <w:t xml:space="preserve">À définir</w:t>
-            </w:r>
-          </w:p>
-        </w:tc>
-        <w:tc>
-          <w:tcPr>
-            <w:tcW w:type="dxa" w:w="3174"/>
-            <w:shd w:fill="FAFAF6" w:color="auto" w:val="clear"/>
-            <w:tcMar>
-              <w:top w:type="dxa" w:w="45"/>
-              <w:left w:type="dxa" w:w="102"/>
-              <w:bottom w:type="dxa" w:w="45"/>
-              <w:right w:type="dxa" w:w="102"/>
-            </w:tcMar>
-            <w:vAlign w:val="center"/>
-          </w:tcPr>
-          <w:p>
-            <w:pPr>
-              <w:spacing w:after="0" w:before="0" w:line="210"/>
-            </w:pPr>
-            <w:r>
-              <w:rPr>
-                <w:rFonts w:ascii="Calibri" w:cs="Calibri" w:eastAsia="Calibri" w:hAnsi="Calibri"/>
-                <w:i/>
-                <w:iCs/>
-                <w:color w:val="9A9A9A"/>
-                <w:sz w:val="15"/>
-                <w:szCs w:val="15"/>
-              </w:rPr>
-              <w:t xml:space="preserve">À définir</w:t>
-            </w:r>
-          </w:p>
-        </w:tc>
-        <w:tc>
-          <w:tcPr>
-            <w:tcW w:type="dxa" w:w="3401"/>
-            <w:shd w:fill="FAFAF6" w:color="auto" w:val="clear"/>
-            <w:tcMar>
-              <w:top w:type="dxa" w:w="45"/>
-              <w:left w:type="dxa" w:w="102"/>
-              <w:bottom w:type="dxa" w:w="45"/>
-              <w:right w:type="dxa" w:w="102"/>
-            </w:tcMar>
-            <w:vAlign w:val="center"/>
-          </w:tcPr>
-          <w:p>
-            <w:pPr>
-              <w:spacing w:after="0" w:before="0" w:line="210"/>
-            </w:pPr>
-            <w:r>
-              <w:rPr>
-                <w:rFonts w:ascii="Calibri" w:cs="Calibri" w:eastAsia="Calibri" w:hAnsi="Calibri"/>
-                <w:i/>
-                <w:iCs/>
-                <w:color w:val="9A9A9A"/>
-                <w:sz w:val="15"/>
-                <w:szCs w:val="15"/>
-              </w:rPr>
-              <w:t xml:space="preserve">À définir</w:t>
-            </w:r>
-          </w:p>
-        </w:tc>
-      </w:tr>
-      <w:tr>
-        <w:trPr>
-          <w:trHeight w:val="289" w:hRule="atLeast"/>
-        </w:trPr>
-        <w:tc>
-          <w:tcPr>
-            <w:tcW w:type="dxa" w:w="15133"/>
-            <w:gridSpan w:val="6"/>
-            <w:shd w:fill="F4F6EA" w:color="auto" w:val="clear"/>
-            <w:tcMar>
-              <w:top w:type="dxa" w:w="56"/>
-              <w:left w:type="dxa" w:w="113"/>
-              <w:bottom w:type="dxa" w:w="56"/>
-              <w:right w:type="dxa" w:w="113"/>
-            </w:tcMar>
-            <w:vAlign w:val="center"/>
-          </w:tcPr>
-          <w:p>
-            <w:pPr>
-              <w:spacing w:after="0" w:before="0" w:line="240"/>
-              <w:jc w:val="center"/>
-            </w:pPr>
-            <w:r>
-              <w:rPr>
-                <w:rFonts w:ascii="Calibri" w:cs="Calibri" w:eastAsia="Calibri" w:hAnsi="Calibri"/>
-                <w:b/>
-                <w:bCs/>
-                <w:color w:val="8A9E28"/>
-                <w:sz w:val="18"/>
-                <w:szCs w:val="18"/>
-              </w:rPr>
-              <w:t xml:space="preserve">MAI — du 25/04 au 09/05, pas de cours</w:t>
-            </w:r>
-          </w:p>
-        </w:tc>
-      </w:tr>
-      <w:tr>
-        <w:trPr>
-          <w:trHeight w:val="334" w:hRule="atLeast"/>
-        </w:trPr>
-        <w:tc>
-          <w:tcPr>
-            <w:tcW w:type="dxa" w:w="1530"/>
-            <w:shd w:fill="FFFFFF" w:color="auto" w:val="clear"/>
-            <w:tcMar>
-              <w:top w:type="dxa" w:w="45"/>
-              <w:left w:type="dxa" w:w="102"/>
-              <w:bottom w:type="dxa" w:w="45"/>
-              <w:right w:type="dxa" w:w="102"/>
-            </w:tcMar>
-            <w:vAlign w:val="center"/>
-          </w:tcPr>
-          <w:p>
-            <w:pPr>
-              <w:spacing w:after="0" w:before="0" w:line="210"/>
-              <w:jc w:val="center"/>
-            </w:pPr>
-            <w:r>
-              <w:rPr>
-                <w:rFonts w:ascii="Calibri" w:cs="Calibri" w:eastAsia="Calibri" w:hAnsi="Calibri"/>
-                <w:b/>
-                <w:bCs/>
-                <w:color w:val="C0392B"/>
-                <w:sz w:val="16"/>
-                <w:szCs w:val="16"/>
-              </w:rPr>
-              <w:t xml:space="preserve">Sem 23</w:t>
-            </w:r>
-            <w:r>
-              <w:rPr>
-                <w:rFonts w:ascii="Calibri" w:cs="Calibri" w:eastAsia="Calibri" w:hAnsi="Calibri"/>
-                <w:color w:val="6E6E6E"/>
-                <w:sz w:val="15"/>
-                <w:szCs w:val="15"/>
-              </w:rPr>
-              <w:t xml:space="preserve">   10/05</w:t>
-            </w:r>
-          </w:p>
-        </w:tc>
-        <w:tc>
-          <w:tcPr>
-            <w:tcW w:type="dxa" w:w="1927"/>
-            <w:shd w:fill="FFFFFF" w:color="auto" w:val="clear"/>
-            <w:tcMar>
-              <w:top w:type="dxa" w:w="45"/>
-              <w:left w:type="dxa" w:w="102"/>
-              <w:bottom w:type="dxa" w:w="45"/>
-              <w:right w:type="dxa" w:w="102"/>
-            </w:tcMar>
-            <w:vAlign w:val="center"/>
-          </w:tcPr>
-          <w:p>
-            <w:pPr>
-              <w:spacing w:after="0" w:before="0" w:line="210"/>
-            </w:pPr>
-            <w:r>
-              <w:rPr>
-                <w:rFonts w:ascii="Calibri" w:cs="Calibri" w:eastAsia="Calibri" w:hAnsi="Calibri"/>
-                <w:color w:val="2E2E2E"/>
-                <w:sz w:val="16"/>
-                <w:szCs w:val="16"/>
-              </w:rPr>
-              <w:t xml:space="preserve">Voir objectifs</w:t>
-            </w:r>
-          </w:p>
-        </w:tc>
-        <w:tc>
-          <w:tcPr>
-            <w:tcW w:type="dxa" w:w="1927"/>
-            <w:shd w:fill="FFFFFF" w:color="auto" w:val="clear"/>
-            <w:tcMar>
-              <w:top w:type="dxa" w:w="45"/>
-              <w:left w:type="dxa" w:w="102"/>
-              <w:bottom w:type="dxa" w:w="45"/>
-              <w:right w:type="dxa" w:w="102"/>
-            </w:tcMar>
-            <w:vAlign w:val="center"/>
-          </w:tcPr>
-          <w:p>
-            <w:pPr>
-              <w:spacing w:after="0" w:before="0" w:line="210"/>
-            </w:pPr>
-            <w:r>
-              <w:rPr>
-                <w:rFonts w:ascii="Calibri" w:cs="Calibri" w:eastAsia="Calibri" w:hAnsi="Calibri"/>
-                <w:color w:val="2E2E2E"/>
-                <w:sz w:val="16"/>
-                <w:szCs w:val="16"/>
-              </w:rPr>
-              <w:t xml:space="preserve">Voir objectifs</w:t>
-            </w:r>
-          </w:p>
-        </w:tc>
-        <w:tc>
-          <w:tcPr>
-            <w:tcW w:type="dxa" w:w="3174"/>
-            <w:shd w:fill="FFFFFF" w:color="auto" w:val="clear"/>
-            <w:tcMar>
-              <w:top w:type="dxa" w:w="45"/>
-              <w:left w:type="dxa" w:w="102"/>
-              <w:bottom w:type="dxa" w:w="45"/>
-              <w:right w:type="dxa" w:w="102"/>
-            </w:tcMar>
-            <w:vAlign w:val="center"/>
-          </w:tcPr>
-          <w:p>
-            <w:pPr>
-              <w:spacing w:after="0" w:before="0" w:line="210"/>
-            </w:pPr>
-            <w:r>
-              <w:rPr>
-                <w:rFonts w:ascii="Calibri" w:cs="Calibri" w:eastAsia="Calibri" w:hAnsi="Calibri"/>
-                <w:i/>
-                <w:iCs/>
-                <w:color w:val="9A9A9A"/>
-                <w:sz w:val="15"/>
-                <w:szCs w:val="15"/>
-              </w:rPr>
-              <w:t xml:space="preserve">À définir</w:t>
-            </w:r>
-          </w:p>
-        </w:tc>
-        <w:tc>
-          <w:tcPr>
-            <w:tcW w:type="dxa" w:w="3174"/>
-            <w:shd w:fill="FFFFFF" w:color="auto" w:val="clear"/>
-            <w:tcMar>
-              <w:top w:type="dxa" w:w="45"/>
-              <w:left w:type="dxa" w:w="102"/>
-              <w:bottom w:type="dxa" w:w="45"/>
-              <w:right w:type="dxa" w:w="102"/>
-            </w:tcMar>
-            <w:vAlign w:val="center"/>
-          </w:tcPr>
-          <w:p>
-            <w:pPr>
-              <w:spacing w:after="0" w:before="0" w:line="210"/>
-            </w:pPr>
-            <w:r>
-              <w:rPr>
-                <w:rFonts w:ascii="Calibri" w:cs="Calibri" w:eastAsia="Calibri" w:hAnsi="Calibri"/>
-                <w:i/>
-                <w:iCs/>
-                <w:color w:val="9A9A9A"/>
-                <w:sz w:val="15"/>
-                <w:szCs w:val="15"/>
-              </w:rPr>
-              <w:t xml:space="preserve">À définir</w:t>
-            </w:r>
-          </w:p>
-        </w:tc>
-        <w:tc>
-          <w:tcPr>
-            <w:tcW w:type="dxa" w:w="3401"/>
-            <w:shd w:fill="FFFFFF" w:color="auto" w:val="clear"/>
-            <w:tcMar>
-              <w:top w:type="dxa" w:w="45"/>
-              <w:left w:type="dxa" w:w="102"/>
-              <w:bottom w:type="dxa" w:w="45"/>
-              <w:right w:type="dxa" w:w="102"/>
-            </w:tcMar>
-            <w:vAlign w:val="center"/>
-          </w:tcPr>
-          <w:p>
-            <w:pPr>
-              <w:spacing w:after="0" w:before="0" w:line="210"/>
-            </w:pPr>
-            <w:r>
-              <w:rPr>
-                <w:rFonts w:ascii="Calibri" w:cs="Calibri" w:eastAsia="Calibri" w:hAnsi="Calibri"/>
-                <w:i/>
-                <w:iCs/>
-                <w:color w:val="9A9A9A"/>
-                <w:sz w:val="15"/>
-                <w:szCs w:val="15"/>
-              </w:rPr>
-              <w:t xml:space="preserve">À définir</w:t>
-            </w:r>
-          </w:p>
-        </w:tc>
-      </w:tr>
-      <w:tr>
-        <w:trPr>
-          <w:trHeight w:val="334" w:hRule="atLeast"/>
-        </w:trPr>
-        <w:tc>
-          <w:tcPr>
-            <w:tcW w:type="dxa" w:w="1530"/>
-            <w:shd w:fill="FAFAF6" w:color="auto" w:val="clear"/>
-            <w:tcMar>
-              <w:top w:type="dxa" w:w="45"/>
-              <w:left w:type="dxa" w:w="102"/>
-              <w:bottom w:type="dxa" w:w="45"/>
-              <w:right w:type="dxa" w:w="102"/>
-            </w:tcMar>
-            <w:vAlign w:val="center"/>
-          </w:tcPr>
-          <w:p>
-            <w:pPr>
-              <w:spacing w:after="0" w:before="0" w:line="210"/>
-              <w:jc w:val="center"/>
-            </w:pPr>
-            <w:r>
-              <w:rPr>
-                <w:rFonts w:ascii="Calibri" w:cs="Calibri" w:eastAsia="Calibri" w:hAnsi="Calibri"/>
-                <w:b/>
-                <w:bCs/>
-                <w:color w:val="C0392B"/>
-                <w:sz w:val="16"/>
-                <w:szCs w:val="16"/>
-              </w:rPr>
-              <w:t xml:space="preserve">Sem 24</w:t>
-            </w:r>
-            <w:r>
-              <w:rPr>
-                <w:rFonts w:ascii="Calibri" w:cs="Calibri" w:eastAsia="Calibri" w:hAnsi="Calibri"/>
-                <w:color w:val="6E6E6E"/>
-                <w:sz w:val="15"/>
-                <w:szCs w:val="15"/>
-              </w:rPr>
-              <w:t xml:space="preserve">   17/05</w:t>
-            </w:r>
-          </w:p>
-        </w:tc>
-        <w:tc>
-          <w:tcPr>
-            <w:tcW w:type="dxa" w:w="1927"/>
-            <w:shd w:fill="FAFAF6" w:color="auto" w:val="clear"/>
-            <w:tcMar>
-              <w:top w:type="dxa" w:w="45"/>
-              <w:left w:type="dxa" w:w="102"/>
-              <w:bottom w:type="dxa" w:w="45"/>
-              <w:right w:type="dxa" w:w="102"/>
-            </w:tcMar>
-            <w:vAlign w:val="center"/>
-          </w:tcPr>
-          <w:p>
-            <w:pPr>
-              <w:spacing w:after="0" w:before="0" w:line="210"/>
-            </w:pPr>
-            <w:r>
-              <w:rPr>
-                <w:rFonts w:ascii="Calibri" w:cs="Calibri" w:eastAsia="Calibri" w:hAnsi="Calibri"/>
-                <w:color w:val="2E2E2E"/>
-                <w:sz w:val="16"/>
-                <w:szCs w:val="16"/>
-              </w:rPr>
-              <w:t xml:space="preserve">Voir objectifs</w:t>
-            </w:r>
-          </w:p>
-        </w:tc>
-        <w:tc>
-          <w:tcPr>
-            <w:tcW w:type="dxa" w:w="1927"/>
-            <w:shd w:fill="FAFAF6" w:color="auto" w:val="clear"/>
-            <w:tcMar>
-              <w:top w:type="dxa" w:w="45"/>
-              <w:left w:type="dxa" w:w="102"/>
-              <w:bottom w:type="dxa" w:w="45"/>
-              <w:right w:type="dxa" w:w="102"/>
-            </w:tcMar>
-            <w:vAlign w:val="center"/>
-          </w:tcPr>
-          <w:p>
-            <w:pPr>
-              <w:spacing w:after="0" w:before="0" w:line="210"/>
-            </w:pPr>
-            <w:r>
-              <w:rPr>
-                <w:rFonts w:ascii="Calibri" w:cs="Calibri" w:eastAsia="Calibri" w:hAnsi="Calibri"/>
-                <w:color w:val="2E2E2E"/>
-                <w:sz w:val="16"/>
-                <w:szCs w:val="16"/>
-              </w:rPr>
-              <w:t xml:space="preserve">Voir objectifs</w:t>
-            </w:r>
-          </w:p>
-        </w:tc>
-        <w:tc>
-          <w:tcPr>
-            <w:tcW w:type="dxa" w:w="3174"/>
-            <w:shd w:fill="FAFAF6" w:color="auto" w:val="clear"/>
-            <w:tcMar>
-              <w:top w:type="dxa" w:w="45"/>
-              <w:left w:type="dxa" w:w="102"/>
-              <w:bottom w:type="dxa" w:w="45"/>
-              <w:right w:type="dxa" w:w="102"/>
-            </w:tcMar>
-            <w:vAlign w:val="center"/>
-          </w:tcPr>
-          <w:p>
-            <w:pPr>
-              <w:spacing w:after="0" w:before="0" w:line="210"/>
-            </w:pPr>
-            <w:r>
-              <w:rPr>
-                <w:rFonts w:ascii="Calibri" w:cs="Calibri" w:eastAsia="Calibri" w:hAnsi="Calibri"/>
-                <w:i/>
-                <w:iCs/>
-                <w:color w:val="9A9A9A"/>
-                <w:sz w:val="15"/>
-                <w:szCs w:val="15"/>
-              </w:rPr>
-              <w:t xml:space="preserve">À définir</w:t>
-            </w:r>
-          </w:p>
-        </w:tc>
-        <w:tc>
-          <w:tcPr>
-            <w:tcW w:type="dxa" w:w="3174"/>
-            <w:shd w:fill="FAFAF6" w:color="auto" w:val="clear"/>
-            <w:tcMar>
-              <w:top w:type="dxa" w:w="45"/>
-              <w:left w:type="dxa" w:w="102"/>
-              <w:bottom w:type="dxa" w:w="45"/>
-              <w:right w:type="dxa" w:w="102"/>
-            </w:tcMar>
-            <w:vAlign w:val="center"/>
-          </w:tcPr>
-          <w:p>
-            <w:pPr>
-              <w:spacing w:after="0" w:before="0" w:line="210"/>
-            </w:pPr>
-            <w:r>
-              <w:rPr>
-                <w:rFonts w:ascii="Calibri" w:cs="Calibri" w:eastAsia="Calibri" w:hAnsi="Calibri"/>
-                <w:i/>
-                <w:iCs/>
-                <w:color w:val="9A9A9A"/>
-                <w:sz w:val="15"/>
-                <w:szCs w:val="15"/>
-              </w:rPr>
-              <w:t xml:space="preserve">À définir</w:t>
-            </w:r>
-          </w:p>
-        </w:tc>
-        <w:tc>
-          <w:tcPr>
-            <w:tcW w:type="dxa" w:w="3401"/>
-            <w:shd w:fill="FAFAF6" w:color="auto" w:val="clear"/>
-            <w:tcMar>
-              <w:top w:type="dxa" w:w="45"/>
-              <w:left w:type="dxa" w:w="102"/>
-              <w:bottom w:type="dxa" w:w="45"/>
-              <w:right w:type="dxa" w:w="102"/>
-            </w:tcMar>
-            <w:vAlign w:val="center"/>
-          </w:tcPr>
-          <w:p>
-            <w:pPr>
-              <w:spacing w:after="0" w:before="0" w:line="210"/>
-            </w:pPr>
-            <w:r>
-              <w:rPr>
-                <w:rFonts w:ascii="Calibri" w:cs="Calibri" w:eastAsia="Calibri" w:hAnsi="Calibri"/>
-                <w:i/>
-                <w:iCs/>
-                <w:color w:val="9A9A9A"/>
-                <w:sz w:val="15"/>
-                <w:szCs w:val="15"/>
-              </w:rPr>
-              <w:t xml:space="preserve">À définir</w:t>
-            </w:r>
-          </w:p>
-        </w:tc>
-      </w:tr>
-      <w:tr>
-        <w:trPr>
-          <w:trHeight w:val="334" w:hRule="atLeast"/>
-        </w:trPr>
-        <w:tc>
-          <w:tcPr>
-            <w:tcW w:type="dxa" w:w="1530"/>
-            <w:shd w:fill="FFFFFF" w:color="auto" w:val="clear"/>
-            <w:tcMar>
-              <w:top w:type="dxa" w:w="45"/>
-              <w:left w:type="dxa" w:w="102"/>
-              <w:bottom w:type="dxa" w:w="45"/>
-              <w:right w:type="dxa" w:w="102"/>
-            </w:tcMar>
-            <w:vAlign w:val="center"/>
-          </w:tcPr>
-          <w:p>
-            <w:pPr>
-              <w:spacing w:after="0" w:before="0" w:line="210"/>
-              <w:jc w:val="center"/>
-            </w:pPr>
-            <w:r>
-              <w:rPr>
-                <w:rFonts w:ascii="Calibri" w:cs="Calibri" w:eastAsia="Calibri" w:hAnsi="Calibri"/>
-                <w:b/>
-                <w:bCs/>
-                <w:color w:val="C0392B"/>
-                <w:sz w:val="16"/>
-                <w:szCs w:val="16"/>
-              </w:rPr>
-              <w:t xml:space="preserve">Sem 25</w:t>
-            </w:r>
-            <w:r>
-              <w:rPr>
-                <w:rFonts w:ascii="Calibri" w:cs="Calibri" w:eastAsia="Calibri" w:hAnsi="Calibri"/>
-                <w:color w:val="6E6E6E"/>
-                <w:sz w:val="15"/>
-                <w:szCs w:val="15"/>
-              </w:rPr>
-              <w:t xml:space="preserve">   24/05</w:t>
-            </w:r>
-          </w:p>
-        </w:tc>
-        <w:tc>
-          <w:tcPr>
-            <w:tcW w:type="dxa" w:w="1927"/>
-            <w:shd w:fill="FFFFFF" w:color="auto" w:val="clear"/>
-            <w:tcMar>
-              <w:top w:type="dxa" w:w="45"/>
-              <w:left w:type="dxa" w:w="102"/>
-              <w:bottom w:type="dxa" w:w="45"/>
-              <w:right w:type="dxa" w:w="102"/>
-            </w:tcMar>
-            <w:vAlign w:val="center"/>
-          </w:tcPr>
-          <w:p>
-            <w:pPr>
-              <w:spacing w:after="0" w:before="0" w:line="210"/>
-            </w:pPr>
-            <w:r>
-              <w:rPr>
-                <w:rFonts w:ascii="Calibri" w:cs="Calibri" w:eastAsia="Calibri" w:hAnsi="Calibri"/>
-                <w:color w:val="2E2E2E"/>
-                <w:sz w:val="16"/>
-                <w:szCs w:val="16"/>
-              </w:rPr>
-              <w:t xml:space="preserve">Voir objectifs</w:t>
-            </w:r>
-          </w:p>
-        </w:tc>
-        <w:tc>
-          <w:tcPr>
-            <w:tcW w:type="dxa" w:w="1927"/>
-            <w:shd w:fill="FFFFFF" w:color="auto" w:val="clear"/>
-            <w:tcMar>
-              <w:top w:type="dxa" w:w="45"/>
-              <w:left w:type="dxa" w:w="102"/>
-              <w:bottom w:type="dxa" w:w="45"/>
-              <w:right w:type="dxa" w:w="102"/>
-            </w:tcMar>
-            <w:vAlign w:val="center"/>
-          </w:tcPr>
-          <w:p>
-            <w:pPr>
-              <w:spacing w:after="0" w:before="0" w:line="210"/>
-            </w:pPr>
-            <w:r>
-              <w:rPr>
-                <w:rFonts w:ascii="Calibri" w:cs="Calibri" w:eastAsia="Calibri" w:hAnsi="Calibri"/>
-                <w:color w:val="2E2E2E"/>
-                <w:sz w:val="16"/>
-                <w:szCs w:val="16"/>
-              </w:rPr>
-              <w:t xml:space="preserve">Voir objectifs</w:t>
-            </w:r>
-          </w:p>
-        </w:tc>
-        <w:tc>
-          <w:tcPr>
-            <w:tcW w:type="dxa" w:w="3174"/>
-            <w:shd w:fill="FFFFFF" w:color="auto" w:val="clear"/>
-            <w:tcMar>
-              <w:top w:type="dxa" w:w="45"/>
-              <w:left w:type="dxa" w:w="102"/>
-              <w:bottom w:type="dxa" w:w="45"/>
-              <w:right w:type="dxa" w:w="102"/>
-            </w:tcMar>
-            <w:vAlign w:val="center"/>
-          </w:tcPr>
-          <w:p>
-            <w:pPr>
-              <w:spacing w:after="0" w:before="0" w:line="210"/>
-            </w:pPr>
-            <w:r>
-              <w:rPr>
-                <w:rFonts w:ascii="Calibri" w:cs="Calibri" w:eastAsia="Calibri" w:hAnsi="Calibri"/>
-                <w:i/>
-                <w:iCs/>
-                <w:color w:val="9A9A9A"/>
-                <w:sz w:val="15"/>
-                <w:szCs w:val="15"/>
-              </w:rPr>
-              <w:t xml:space="preserve">À définir</w:t>
-            </w:r>
-          </w:p>
-        </w:tc>
-        <w:tc>
-          <w:tcPr>
-            <w:tcW w:type="dxa" w:w="3174"/>
-            <w:shd w:fill="FFFFFF" w:color="auto" w:val="clear"/>
-            <w:tcMar>
-              <w:top w:type="dxa" w:w="45"/>
-              <w:left w:type="dxa" w:w="102"/>
-              <w:bottom w:type="dxa" w:w="45"/>
-              <w:right w:type="dxa" w:w="102"/>
-            </w:tcMar>
-            <w:vAlign w:val="center"/>
-          </w:tcPr>
-          <w:p>
-            <w:pPr>
-              <w:spacing w:after="0" w:before="0" w:line="210"/>
-            </w:pPr>
-            <w:r>
-              <w:rPr>
-                <w:rFonts w:ascii="Calibri" w:cs="Calibri" w:eastAsia="Calibri" w:hAnsi="Calibri"/>
-                <w:i/>
-                <w:iCs/>
-                <w:color w:val="9A9A9A"/>
-                <w:sz w:val="15"/>
-                <w:szCs w:val="15"/>
-              </w:rPr>
-              <w:t xml:space="preserve">À définir</w:t>
-            </w:r>
-          </w:p>
-        </w:tc>
-        <w:tc>
-          <w:tcPr>
-            <w:tcW w:type="dxa" w:w="3401"/>
-            <w:shd w:fill="FFFFFF" w:color="auto" w:val="clear"/>
-            <w:tcMar>
-              <w:top w:type="dxa" w:w="45"/>
-              <w:left w:type="dxa" w:w="102"/>
-              <w:bottom w:type="dxa" w:w="45"/>
-              <w:right w:type="dxa" w:w="102"/>
-            </w:tcMar>
-            <w:vAlign w:val="center"/>
-          </w:tcPr>
-          <w:p>
-            <w:pPr>
-              <w:spacing w:after="0" w:before="0" w:line="210"/>
-            </w:pPr>
-            <w:r>
-              <w:rPr>
-                <w:rFonts w:ascii="Calibri" w:cs="Calibri" w:eastAsia="Calibri" w:hAnsi="Calibri"/>
-                <w:i/>
-                <w:iCs/>
-                <w:color w:val="9A9A9A"/>
-                <w:sz w:val="15"/>
-                <w:szCs w:val="15"/>
-              </w:rPr>
-              <w:t xml:space="preserve">À définir</w:t>
-            </w:r>
-          </w:p>
-        </w:tc>
-      </w:tr>
-      <w:tr>
-        <w:trPr>
-          <w:trHeight w:val="334" w:hRule="atLeast"/>
-        </w:trPr>
-        <w:tc>
-          <w:tcPr>
-            <w:tcW w:type="dxa" w:w="1530"/>
-            <w:shd w:fill="FAFAF6" w:color="auto" w:val="clear"/>
-            <w:tcMar>
-              <w:top w:type="dxa" w:w="45"/>
-              <w:left w:type="dxa" w:w="102"/>
-              <w:bottom w:type="dxa" w:w="45"/>
-              <w:right w:type="dxa" w:w="102"/>
-            </w:tcMar>
-            <w:vAlign w:val="center"/>
-          </w:tcPr>
-          <w:p>
-            <w:pPr>
-              <w:spacing w:after="0" w:before="0" w:line="210"/>
-              <w:jc w:val="center"/>
-            </w:pPr>
-            <w:r>
-              <w:rPr>
-                <w:rFonts w:ascii="Calibri" w:cs="Calibri" w:eastAsia="Calibri" w:hAnsi="Calibri"/>
-                <w:b/>
-                <w:bCs/>
-                <w:color w:val="C0392B"/>
-                <w:sz w:val="16"/>
-                <w:szCs w:val="16"/>
-              </w:rPr>
-              <w:t xml:space="preserve">Sem 26</w:t>
-            </w:r>
-            <w:r>
-              <w:rPr>
-                <w:rFonts w:ascii="Calibri" w:cs="Calibri" w:eastAsia="Calibri" w:hAnsi="Calibri"/>
-                <w:color w:val="6E6E6E"/>
-                <w:sz w:val="15"/>
-                <w:szCs w:val="15"/>
-              </w:rPr>
-              <w:t xml:space="preserve">   31/05</w:t>
-            </w:r>
-          </w:p>
-        </w:tc>
-        <w:tc>
-          <w:tcPr>
-            <w:tcW w:type="dxa" w:w="1927"/>
-            <w:shd w:fill="FAFAF6" w:color="auto" w:val="clear"/>
-            <w:tcMar>
-              <w:top w:type="dxa" w:w="45"/>
-              <w:left w:type="dxa" w:w="102"/>
-              <w:bottom w:type="dxa" w:w="45"/>
-              <w:right w:type="dxa" w:w="102"/>
-            </w:tcMar>
-            <w:vAlign w:val="center"/>
-          </w:tcPr>
-          <w:p>
-            <w:pPr>
-              <w:spacing w:after="0" w:before="0" w:line="210"/>
-            </w:pPr>
-            <w:r>
-              <w:rPr>
-                <w:rFonts w:ascii="Calibri" w:cs="Calibri" w:eastAsia="Calibri" w:hAnsi="Calibri"/>
-                <w:color w:val="2E2E2E"/>
-                <w:sz w:val="16"/>
-                <w:szCs w:val="16"/>
-              </w:rPr>
-              <w:t xml:space="preserve">Voir objectifs</w:t>
-            </w:r>
-          </w:p>
-        </w:tc>
-        <w:tc>
-          <w:tcPr>
-            <w:tcW w:type="dxa" w:w="1927"/>
-            <w:shd w:fill="FAFAF6" w:color="auto" w:val="clear"/>
-            <w:tcMar>
-              <w:top w:type="dxa" w:w="45"/>
-              <w:left w:type="dxa" w:w="102"/>
-              <w:bottom w:type="dxa" w:w="45"/>
-              <w:right w:type="dxa" w:w="102"/>
-            </w:tcMar>
-            <w:vAlign w:val="center"/>
-          </w:tcPr>
-          <w:p>
-            <w:pPr>
-              <w:spacing w:after="0" w:before="0" w:line="210"/>
-            </w:pPr>
-            <w:r>
-              <w:rPr>
-                <w:rFonts w:ascii="Calibri" w:cs="Calibri" w:eastAsia="Calibri" w:hAnsi="Calibri"/>
-                <w:color w:val="2E2E2E"/>
-                <w:sz w:val="16"/>
-                <w:szCs w:val="16"/>
-              </w:rPr>
-              <w:t xml:space="preserve">Voir objectifs</w:t>
-            </w:r>
-          </w:p>
-        </w:tc>
-        <w:tc>
-          <w:tcPr>
-            <w:tcW w:type="dxa" w:w="3174"/>
-            <w:shd w:fill="FAFAF6" w:color="auto" w:val="clear"/>
-            <w:tcMar>
-              <w:top w:type="dxa" w:w="45"/>
-              <w:left w:type="dxa" w:w="102"/>
-              <w:bottom w:type="dxa" w:w="45"/>
-              <w:right w:type="dxa" w:w="102"/>
-            </w:tcMar>
-            <w:vAlign w:val="center"/>
-          </w:tcPr>
-          <w:p>
-            <w:pPr>
-              <w:spacing w:after="0" w:before="0" w:line="210"/>
-            </w:pPr>
-            <w:r>
-              <w:rPr>
-                <w:rFonts w:ascii="Calibri" w:cs="Calibri" w:eastAsia="Calibri" w:hAnsi="Calibri"/>
-                <w:i/>
-                <w:iCs/>
-                <w:color w:val="9A9A9A"/>
-                <w:sz w:val="15"/>
-                <w:szCs w:val="15"/>
-              </w:rPr>
-              <w:t xml:space="preserve">À définir</w:t>
-            </w:r>
-          </w:p>
-        </w:tc>
-        <w:tc>
-          <w:tcPr>
-            <w:tcW w:type="dxa" w:w="3174"/>
-            <w:shd w:fill="FAFAF6" w:color="auto" w:val="clear"/>
-            <w:tcMar>
-              <w:top w:type="dxa" w:w="45"/>
-              <w:left w:type="dxa" w:w="102"/>
-              <w:bottom w:type="dxa" w:w="45"/>
-              <w:right w:type="dxa" w:w="102"/>
-            </w:tcMar>
-            <w:vAlign w:val="center"/>
-          </w:tcPr>
-          <w:p>
-            <w:pPr>
-              <w:spacing w:after="0" w:before="0" w:line="210"/>
-            </w:pPr>
-            <w:r>
-              <w:rPr>
-                <w:rFonts w:ascii="Calibri" w:cs="Calibri" w:eastAsia="Calibri" w:hAnsi="Calibri"/>
-                <w:i/>
-                <w:iCs/>
-                <w:color w:val="9A9A9A"/>
-                <w:sz w:val="15"/>
-                <w:szCs w:val="15"/>
-              </w:rPr>
-              <w:t xml:space="preserve">À définir</w:t>
-            </w:r>
-          </w:p>
-        </w:tc>
-        <w:tc>
-          <w:tcPr>
-            <w:tcW w:type="dxa" w:w="3401"/>
-            <w:shd w:fill="FAFAF6" w:color="auto" w:val="clear"/>
-            <w:tcMar>
-              <w:top w:type="dxa" w:w="45"/>
-              <w:left w:type="dxa" w:w="102"/>
-              <w:bottom w:type="dxa" w:w="45"/>
-              <w:right w:type="dxa" w:w="102"/>
-            </w:tcMar>
-            <w:vAlign w:val="center"/>
-          </w:tcPr>
-          <w:p>
-            <w:pPr>
-              <w:spacing w:after="0" w:before="0" w:line="210"/>
-            </w:pPr>
-            <w:r>
-              <w:rPr>
-                <w:rFonts w:ascii="Calibri" w:cs="Calibri" w:eastAsia="Calibri" w:hAnsi="Calibri"/>
-                <w:i/>
-                <w:iCs/>
-                <w:color w:val="9A9A9A"/>
-                <w:sz w:val="15"/>
-                <w:szCs w:val="15"/>
-              </w:rPr>
-              <w:t xml:space="preserve">À définir</w:t>
-            </w:r>
-          </w:p>
-        </w:tc>
-      </w:tr>
-      <w:tr>
-        <w:trPr>
-          <w:trHeight w:val="334" w:hRule="atLeast"/>
-        </w:trPr>
-        <w:tc>
-          <w:tcPr>
-            <w:tcW w:type="dxa" w:w="1530"/>
-            <w:shd w:fill="FFFFFF" w:color="auto" w:val="clear"/>
-            <w:tcMar>
-              <w:top w:type="dxa" w:w="45"/>
-              <w:left w:type="dxa" w:w="102"/>
-              <w:bottom w:type="dxa" w:w="45"/>
-              <w:right w:type="dxa" w:w="102"/>
-            </w:tcMar>
-            <w:vAlign w:val="center"/>
-          </w:tcPr>
-          <w:p>
-            <w:pPr>
-              <w:spacing w:after="0" w:before="0" w:line="210"/>
-              <w:jc w:val="center"/>
-            </w:pPr>
-            <w:r>
-              <w:rPr>
-                <w:rFonts w:ascii="Calibri" w:cs="Calibri" w:eastAsia="Calibri" w:hAnsi="Calibri"/>
-                <w:b/>
-                <w:bCs/>
-                <w:color w:val="C0392B"/>
-                <w:sz w:val="16"/>
-                <w:szCs w:val="16"/>
-              </w:rPr>
-              <w:t xml:space="preserve">Sem 27</w:t>
-            </w:r>
-            <w:r>
-              <w:rPr>
-                <w:rFonts w:ascii="Calibri" w:cs="Calibri" w:eastAsia="Calibri" w:hAnsi="Calibri"/>
-                <w:color w:val="6E6E6E"/>
-                <w:sz w:val="15"/>
-                <w:szCs w:val="15"/>
-              </w:rPr>
-              <w:t xml:space="preserve">   07/06</w:t>
-            </w:r>
-          </w:p>
-        </w:tc>
-        <w:tc>
-          <w:tcPr>
-            <w:tcW w:type="dxa" w:w="1927"/>
-            <w:shd w:fill="FFFFFF" w:color="auto" w:val="clear"/>
-            <w:tcMar>
-              <w:top w:type="dxa" w:w="45"/>
-              <w:left w:type="dxa" w:w="102"/>
-              <w:bottom w:type="dxa" w:w="45"/>
-              <w:right w:type="dxa" w:w="102"/>
-            </w:tcMar>
-            <w:vAlign w:val="center"/>
-          </w:tcPr>
-          <w:p>
-            <w:pPr>
-              <w:spacing w:after="0" w:before="0" w:line="210"/>
-            </w:pPr>
-            <w:r>
-              <w:rPr>
-                <w:rFonts w:ascii="Calibri" w:cs="Calibri" w:eastAsia="Calibri" w:hAnsi="Calibri"/>
-                <w:color w:val="2E2E2E"/>
-                <w:sz w:val="16"/>
-                <w:szCs w:val="16"/>
-              </w:rPr>
-              <w:t xml:space="preserve">Voir objectifs</w:t>
-            </w:r>
-          </w:p>
-        </w:tc>
-        <w:tc>
-          <w:tcPr>
-            <w:tcW w:type="dxa" w:w="1927"/>
-            <w:shd w:fill="FFFFFF" w:color="auto" w:val="clear"/>
-            <w:tcMar>
-              <w:top w:type="dxa" w:w="45"/>
-              <w:left w:type="dxa" w:w="102"/>
-              <w:bottom w:type="dxa" w:w="45"/>
-              <w:right w:type="dxa" w:w="102"/>
-            </w:tcMar>
-            <w:vAlign w:val="center"/>
-          </w:tcPr>
-          <w:p>
-            <w:pPr>
-              <w:spacing w:after="0" w:before="0" w:line="210"/>
-            </w:pPr>
-            <w:r>
-              <w:rPr>
-                <w:rFonts w:ascii="Calibri" w:cs="Calibri" w:eastAsia="Calibri" w:hAnsi="Calibri"/>
-                <w:color w:val="2E2E2E"/>
-                <w:sz w:val="16"/>
-                <w:szCs w:val="16"/>
-              </w:rPr>
-              <w:t xml:space="preserve">Voir objectifs</w:t>
-            </w:r>
-          </w:p>
-        </w:tc>
-        <w:tc>
-          <w:tcPr>
-            <w:tcW w:type="dxa" w:w="3174"/>
-            <w:shd w:fill="FFFFFF" w:color="auto" w:val="clear"/>
-            <w:tcMar>
-              <w:top w:type="dxa" w:w="45"/>
-              <w:left w:type="dxa" w:w="102"/>
-              <w:bottom w:type="dxa" w:w="45"/>
-              <w:right w:type="dxa" w:w="102"/>
-            </w:tcMar>
-            <w:vAlign w:val="center"/>
-          </w:tcPr>
-          <w:p>
-            <w:pPr>
-              <w:spacing w:after="0" w:before="0" w:line="210"/>
-            </w:pPr>
-            <w:r>
-              <w:rPr>
-                <w:rFonts w:ascii="Calibri" w:cs="Calibri" w:eastAsia="Calibri" w:hAnsi="Calibri"/>
-                <w:i/>
-                <w:iCs/>
-                <w:color w:val="9A9A9A"/>
-                <w:sz w:val="15"/>
-                <w:szCs w:val="15"/>
-              </w:rPr>
-              <w:t xml:space="preserve">À définir</w:t>
-            </w:r>
-          </w:p>
-        </w:tc>
-        <w:tc>
-          <w:tcPr>
-            <w:tcW w:type="dxa" w:w="3174"/>
-            <w:shd w:fill="FFFFFF" w:color="auto" w:val="clear"/>
-            <w:tcMar>
-              <w:top w:type="dxa" w:w="45"/>
-              <w:left w:type="dxa" w:w="102"/>
-              <w:bottom w:type="dxa" w:w="45"/>
-              <w:right w:type="dxa" w:w="102"/>
-            </w:tcMar>
-            <w:vAlign w:val="center"/>
-          </w:tcPr>
-          <w:p>
-            <w:pPr>
-              <w:spacing w:after="0" w:before="0" w:line="210"/>
-            </w:pPr>
-            <w:r>
-              <w:rPr>
-                <w:rFonts w:ascii="Calibri" w:cs="Calibri" w:eastAsia="Calibri" w:hAnsi="Calibri"/>
-                <w:i/>
-                <w:iCs/>
-                <w:color w:val="9A9A9A"/>
-                <w:sz w:val="15"/>
-                <w:szCs w:val="15"/>
-              </w:rPr>
-              <w:t xml:space="preserve">À définir</w:t>
-            </w:r>
-          </w:p>
-        </w:tc>
-        <w:tc>
-          <w:tcPr>
-            <w:tcW w:type="dxa" w:w="3401"/>
-            <w:shd w:fill="FFFFFF" w:color="auto" w:val="clear"/>
-            <w:tcMar>
-              <w:top w:type="dxa" w:w="45"/>
-              <w:left w:type="dxa" w:w="102"/>
-              <w:bottom w:type="dxa" w:w="45"/>
-              <w:right w:type="dxa" w:w="102"/>
-            </w:tcMar>
-            <w:vAlign w:val="center"/>
-          </w:tcPr>
-          <w:p>
-            <w:pPr>
-              <w:spacing w:after="0" w:before="0" w:line="210"/>
-            </w:pPr>
-            <w:r>
-              <w:rPr>
-                <w:rFonts w:ascii="Calibri" w:cs="Calibri" w:eastAsia="Calibri" w:hAnsi="Calibri"/>
-                <w:i/>
-                <w:iCs/>
-                <w:color w:val="9A9A9A"/>
-                <w:sz w:val="15"/>
-                <w:szCs w:val="15"/>
-              </w:rPr>
-              <w:t xml:space="preserve">À définir</w:t>
-            </w:r>
-          </w:p>
-        </w:tc>
-      </w:tr>
-      <w:tr>
-        <w:trPr>
-          <w:trHeight w:val="334" w:hRule="atLeast"/>
-        </w:trPr>
-        <w:tc>
-          <w:tcPr>
-            <w:tcW w:type="dxa" w:w="1530"/>
-            <w:shd w:fill="FAFAF6" w:color="auto" w:val="clear"/>
-            <w:tcMar>
-              <w:top w:type="dxa" w:w="45"/>
-              <w:left w:type="dxa" w:w="102"/>
-              <w:bottom w:type="dxa" w:w="45"/>
-              <w:right w:type="dxa" w:w="102"/>
-            </w:tcMar>
-            <w:vAlign w:val="center"/>
-          </w:tcPr>
-          <w:p>
-            <w:pPr>
-              <w:spacing w:after="0" w:before="0" w:line="210"/>
-              <w:jc w:val="center"/>
-            </w:pPr>
-            <w:r>
-              <w:rPr>
-                <w:rFonts w:ascii="Calibri" w:cs="Calibri" w:eastAsia="Calibri" w:hAnsi="Calibri"/>
-                <w:b/>
-                <w:bCs/>
-                <w:color w:val="C0392B"/>
-                <w:sz w:val="16"/>
-                <w:szCs w:val="16"/>
-              </w:rPr>
-              <w:t xml:space="preserve">Sem 28</w:t>
-            </w:r>
-            <w:r>
-              <w:rPr>
-                <w:rFonts w:ascii="Calibri" w:cs="Calibri" w:eastAsia="Calibri" w:hAnsi="Calibri"/>
-                <w:color w:val="6E6E6E"/>
-                <w:sz w:val="15"/>
-                <w:szCs w:val="15"/>
-              </w:rPr>
-              <w:t xml:space="preserve">   14/06</w:t>
-            </w:r>
-          </w:p>
-        </w:tc>
-        <w:tc>
-          <w:tcPr>
-            <w:tcW w:type="dxa" w:w="1927"/>
-            <w:shd w:fill="FAFAF6" w:color="auto" w:val="clear"/>
-            <w:tcMar>
-              <w:top w:type="dxa" w:w="45"/>
-              <w:left w:type="dxa" w:w="102"/>
-              <w:bottom w:type="dxa" w:w="45"/>
-              <w:right w:type="dxa" w:w="102"/>
-            </w:tcMar>
-            <w:vAlign w:val="center"/>
-          </w:tcPr>
-          <w:p>
-            <w:pPr>
-              <w:spacing w:after="0" w:before="0" w:line="210"/>
-            </w:pPr>
-            <w:r>
-              <w:rPr>
-                <w:rFonts w:ascii="Calibri" w:cs="Calibri" w:eastAsia="Calibri" w:hAnsi="Calibri"/>
-                <w:color w:val="2E2E2E"/>
-                <w:sz w:val="16"/>
-                <w:szCs w:val="16"/>
-              </w:rPr>
-              <w:t xml:space="preserve">Voir objectifs</w:t>
-            </w:r>
-          </w:p>
-        </w:tc>
-        <w:tc>
-          <w:tcPr>
-            <w:tcW w:type="dxa" w:w="1927"/>
-            <w:shd w:fill="FAFAF6" w:color="auto" w:val="clear"/>
-            <w:tcMar>
-              <w:top w:type="dxa" w:w="45"/>
-              <w:left w:type="dxa" w:w="102"/>
-              <w:bottom w:type="dxa" w:w="45"/>
-              <w:right w:type="dxa" w:w="102"/>
-            </w:tcMar>
-            <w:vAlign w:val="center"/>
-          </w:tcPr>
-          <w:p>
-            <w:pPr>
-              <w:spacing w:after="0" w:before="0" w:line="210"/>
-            </w:pPr>
-            <w:r>
-              <w:rPr>
-                <w:rFonts w:ascii="Calibri" w:cs="Calibri" w:eastAsia="Calibri" w:hAnsi="Calibri"/>
-                <w:color w:val="2E2E2E"/>
-                <w:sz w:val="16"/>
-                <w:szCs w:val="16"/>
-              </w:rPr>
-              <w:t xml:space="preserve">Voir objectifs</w:t>
-            </w:r>
-          </w:p>
-        </w:tc>
-        <w:tc>
-          <w:tcPr>
-            <w:tcW w:type="dxa" w:w="3174"/>
-            <w:shd w:fill="FAFAF6" w:color="auto" w:val="clear"/>
-            <w:tcMar>
-              <w:top w:type="dxa" w:w="45"/>
-              <w:left w:type="dxa" w:w="102"/>
-              <w:bottom w:type="dxa" w:w="45"/>
-              <w:right w:type="dxa" w:w="102"/>
-            </w:tcMar>
-            <w:vAlign w:val="center"/>
-          </w:tcPr>
-          <w:p>
-            <w:pPr>
-              <w:spacing w:after="0" w:before="0" w:line="210"/>
-            </w:pPr>
-            <w:r>
-              <w:rPr>
-                <w:rFonts w:ascii="Calibri" w:cs="Calibri" w:eastAsia="Calibri" w:hAnsi="Calibri"/>
-                <w:i/>
-                <w:iCs/>
-                <w:color w:val="9A9A9A"/>
-                <w:sz w:val="15"/>
-                <w:szCs w:val="15"/>
-              </w:rPr>
-              <w:t xml:space="preserve">À définir</w:t>
-            </w:r>
-          </w:p>
-        </w:tc>
-        <w:tc>
-          <w:tcPr>
-            <w:tcW w:type="dxa" w:w="3174"/>
-            <w:shd w:fill="FAFAF6" w:color="auto" w:val="clear"/>
-            <w:tcMar>
-              <w:top w:type="dxa" w:w="45"/>
-              <w:left w:type="dxa" w:w="102"/>
-              <w:bottom w:type="dxa" w:w="45"/>
-              <w:right w:type="dxa" w:w="102"/>
-            </w:tcMar>
-            <w:vAlign w:val="center"/>
-          </w:tcPr>
-          <w:p>
-            <w:pPr>
-              <w:spacing w:after="0" w:before="0" w:line="210"/>
-            </w:pPr>
-            <w:r>
-              <w:rPr>
-                <w:rFonts w:ascii="Calibri" w:cs="Calibri" w:eastAsia="Calibri" w:hAnsi="Calibri"/>
-                <w:i/>
-                <w:iCs/>
-                <w:color w:val="9A9A9A"/>
-                <w:sz w:val="15"/>
-                <w:szCs w:val="15"/>
-              </w:rPr>
-              <w:t xml:space="preserve">À définir</w:t>
-            </w:r>
-          </w:p>
-        </w:tc>
-        <w:tc>
-          <w:tcPr>
-            <w:tcW w:type="dxa" w:w="3401"/>
-            <w:shd w:fill="FAFAF6" w:color="auto" w:val="clear"/>
-            <w:tcMar>
-              <w:top w:type="dxa" w:w="45"/>
-              <w:left w:type="dxa" w:w="102"/>
-              <w:bottom w:type="dxa" w:w="45"/>
-              <w:right w:type="dxa" w:w="102"/>
-            </w:tcMar>
-            <w:vAlign w:val="center"/>
-          </w:tcPr>
-          <w:p>
-            <w:pPr>
-              <w:spacing w:after="0" w:before="0" w:line="210"/>
-            </w:pPr>
-            <w:r>
-              <w:rPr>
-                <w:rFonts w:ascii="Calibri" w:cs="Calibri" w:eastAsia="Calibri" w:hAnsi="Calibri"/>
-                <w:i/>
-                <w:iCs/>
-                <w:color w:val="9A9A9A"/>
-                <w:sz w:val="15"/>
-                <w:szCs w:val="15"/>
-              </w:rPr>
-              <w:t xml:space="preserve">À définir</w:t>
             </w:r>
           </w:p>
         </w:tc>
@@ -5607,7 +4055,7 @@
     </w:tbl>
     <w:p>
       <w:pPr>
-        <w:spacing w:after="0" w:before="70" w:line="240"/>
+        <w:spacing w:after="0" w:before="50" w:line="240"/>
       </w:pPr>
       <w:r>
         <w:rPr>
@@ -5618,7 +4066,7 @@
           <w:sz w:val="15"/>
           <w:szCs w:val="15"/>
         </w:rPr>
-        <w:t xml:space="preserve">Reprise le lendemain de chaque fin d’interruption. Seule exception : la Toussaint s’achève un vendredi — les cours reprennent le samedi 31 octobre.</w:t>
+        <w:t xml:space="preserve">Reprise le lendemain de chaque fin d’interruption. Seule exception : la Toussaint s’achève un vendredi — les cours reprennent le samedi 31 octobre. Le programme du printemps fait l’objet d’un document distinct.</w:t>
       </w:r>
     </w:p>
     <w:p>
@@ -5658,7 +4106,7 @@
           <w:sz w:val="20"/>
           <w:szCs w:val="20"/>
         </w:rPr>
-        <w:t xml:space="preserve">Saison 2026-2027</w:t>
+        <w:t xml:space="preserve">Saison hiver 2026-2027</w:t>
       </w:r>
     </w:p>
     <w:p>
@@ -5844,7 +4292,7 @@
         <w:sz w:val="15"/>
         <w:szCs w:val="15"/>
       </w:rPr>
-      <w:t xml:space="preserve">Lambermont Royal Tennis Club &amp; School  ·  Thèmes des cours  ·  Saison 2026-2027</w:t>
+      <w:t xml:space="preserve">Lambermont Royal Tennis Club &amp; School  ·  Thèmes des cours  ·  Saison hiver 2026-2027</w:t>
     </w:r>
   </w:p>
 </w:ftr>

</xml_diff>